<commit_message>
complete port scanner assignment2
</commit_message>
<xml_diff>
--- a/AI Usage Declaration.docx
+++ b/AI Usage Declaration.docx
@@ -1,10 +1,9 @@
 
 <file path=word/document.xml><?xml version="1.0" encoding="utf-8"?>
-<w:document xmlns:o="urn:schemas-microsoft-com:office:office" xmlns:r="http://schemas.openxmlformats.org/officeDocument/2006/relationships" xmlns:v="urn:schemas-microsoft-com:vml" xmlns:w="http://schemas.openxmlformats.org/wordprocessingml/2006/main" xmlns:w10="urn:schemas-microsoft-com:office:word" xmlns:wp="http://schemas.openxmlformats.org/drawingml/2006/wordprocessingDrawing" xmlns:wps="http://schemas.microsoft.com/office/word/2010/wordprocessingShape" xmlns:wpg="http://schemas.microsoft.com/office/word/2010/wordprocessingGroup" xmlns:mc="http://schemas.openxmlformats.org/markup-compatibility/2006" xmlns:wp14="http://schemas.microsoft.com/office/word/2010/wordprocessingDrawing" xmlns:w14="http://schemas.microsoft.com/office/word/2010/wordml" xmlns:w15="http://schemas.microsoft.com/office/word/2012/wordml" mc:Ignorable="w14 wp14 w15">
+<w:document xmlns:wpc="http://schemas.microsoft.com/office/word/2010/wordprocessingCanvas" xmlns:cx="http://schemas.microsoft.com/office/drawing/2014/chartex" xmlns:cx1="http://schemas.microsoft.com/office/drawing/2015/9/8/chartex" xmlns:cx2="http://schemas.microsoft.com/office/drawing/2015/10/21/chartex" xmlns:cx3="http://schemas.microsoft.com/office/drawing/2016/5/9/chartex" xmlns:cx4="http://schemas.microsoft.com/office/drawing/2016/5/10/chartex" xmlns:cx5="http://schemas.microsoft.com/office/drawing/2016/5/11/chartex" xmlns:cx6="http://schemas.microsoft.com/office/drawing/2016/5/12/chartex" xmlns:cx7="http://schemas.microsoft.com/office/drawing/2016/5/13/chartex" xmlns:cx8="http://schemas.microsoft.com/office/drawing/2016/5/14/chartex" xmlns:mc="http://schemas.openxmlformats.org/markup-compatibility/2006" xmlns:aink="http://schemas.microsoft.com/office/drawing/2016/ink" xmlns:am3d="http://schemas.microsoft.com/office/drawing/2017/model3d" xmlns:o="urn:schemas-microsoft-com:office:office" xmlns:oel="http://schemas.microsoft.com/office/2019/extlst" xmlns:r="http://schemas.openxmlformats.org/officeDocument/2006/relationships" xmlns:m="http://schemas.openxmlformats.org/officeDocument/2006/math" xmlns:v="urn:schemas-microsoft-com:vml" xmlns:wp14="http://schemas.microsoft.com/office/word/2010/wordprocessingDrawing" xmlns:wp="http://schemas.openxmlformats.org/drawingml/2006/wordprocessingDrawing" xmlns:w10="urn:schemas-microsoft-com:office:word" xmlns:w="http://schemas.openxmlformats.org/wordprocessingml/2006/main" xmlns:w14="http://schemas.microsoft.com/office/word/2010/wordml" xmlns:w15="http://schemas.microsoft.com/office/word/2012/wordml" xmlns:w16cex="http://schemas.microsoft.com/office/word/2018/wordml/cex" xmlns:w16cid="http://schemas.microsoft.com/office/word/2016/wordml/cid" xmlns:w16="http://schemas.microsoft.com/office/word/2018/wordml" xmlns:w16du="http://schemas.microsoft.com/office/word/2023/wordml/word16du" xmlns:w16sdtdh="http://schemas.microsoft.com/office/word/2020/wordml/sdtdatahash" xmlns:w16sdtfl="http://schemas.microsoft.com/office/word/2024/wordml/sdtformatlock" xmlns:w16se="http://schemas.microsoft.com/office/word/2015/wordml/symex" xmlns:wpg="http://schemas.microsoft.com/office/word/2010/wordprocessingGroup" xmlns:wpi="http://schemas.microsoft.com/office/word/2010/wordprocessingInk" xmlns:wne="http://schemas.microsoft.com/office/word/2006/wordml" xmlns:wps="http://schemas.microsoft.com/office/word/2010/wordprocessingShape" mc:Ignorable="w14 w15 w16se w16cid w16 w16cex w16sdtdh w16sdtfl w16du wp14">
   <w:body>
     <w:p>
       <w:pPr>
-        <w:pStyle w:val="Normal"/>
         <w:rPr>
           <w:b/>
           <w:bCs/>
@@ -26,7 +25,6 @@
       <w:pPr>
         <w:pStyle w:val="Heading3"/>
         <w:spacing w:before="281" w:after="281"/>
-        <w:rPr/>
       </w:pPr>
       <w:r>
         <w:rPr>
@@ -40,13 +38,10 @@
       </w:r>
     </w:p>
     <w:p>
-      <w:pPr>
-        <w:pStyle w:val="Normal"/>
-        <w:rPr/>
-      </w:pPr>
-      <w:r>
-        <w:rPr/>
+      <w:r>
         <w:t xml:space="preserve">When completing your assignment, you must download and fill out the "AI Usage Declaration" form for each assignment where AI use is permitted. </w:t>
+      </w:r>
+      <w:r>
         <w:br/>
         <w:t>Once completed, convert the form to a PDF and save it as “</w:t>
       </w:r>
@@ -58,8 +53,9 @@
         <w:t>aud.pdf”</w:t>
       </w:r>
       <w:r>
-        <w:rPr/>
         <w:t>. Submit this PDF along with your assignment.</w:t>
+      </w:r>
+      <w:r>
         <w:br/>
         <w:t xml:space="preserve">This declaration is </w:t>
       </w:r>
@@ -71,38 +67,18 @@
         <w:t>required</w:t>
       </w:r>
       <w:r>
-        <w:rPr/>
-        <w:t xml:space="preserve"> </w:t>
-      </w:r>
-      <w:r>
-        <w:rPr/>
-        <w:t>if using AI tools when completing your assignment use,</w:t>
-      </w:r>
-      <w:r>
-        <w:rPr/>
-        <w:t xml:space="preserve"> and failure to submit it will result in a zero for the assignment. Ensure all information provided is accurate and aligns with the academic integrity guidelines.</w:t>
-      </w:r>
-    </w:p>
-    <w:p>
-      <w:pPr>
-        <w:pStyle w:val="Normal"/>
-        <w:rPr>
-          <w:b/>
-          <w:bCs/>
-        </w:rPr>
-      </w:pPr>
-      <w:r>
-        <w:rPr>
-          <w:b/>
-          <w:bCs/>
-        </w:rPr>
-      </w:r>
-    </w:p>
-    <w:p>
-      <w:pPr>
-        <w:pStyle w:val="Normal"/>
-        <w:rPr/>
-      </w:pPr>
+        <w:t xml:space="preserve"> if using AI tools when completing your assignment use, and failure to submit it will result in a zero for the assignment. Ensure all information provided is accurate and aligns with the academic integrity guidelines.</w:t>
+      </w:r>
+    </w:p>
+    <w:p>
+      <w:pPr>
+        <w:rPr>
+          <w:b/>
+          <w:bCs/>
+        </w:rPr>
+      </w:pPr>
+    </w:p>
+    <w:p>
       <w:r>
         <w:rPr>
           <w:b/>
@@ -113,51 +89,47 @@
     </w:p>
     <w:p>
       <w:pPr>
-        <w:pStyle w:val="Normal"/>
         <w:numPr>
           <w:ilvl w:val="0"/>
           <w:numId w:val="1"/>
         </w:numPr>
-        <w:rPr/>
-      </w:pPr>
-      <w:r>
-        <w:rPr/>
-        <w:t>Name: _____________________________________</w:t>
-      </w:r>
-    </w:p>
-    <w:p>
-      <w:pPr>
-        <w:pStyle w:val="Normal"/>
+      </w:pPr>
+      <w:r>
+        <w:t xml:space="preserve">Name: </w:t>
+      </w:r>
+      <w:r>
+        <w:t>Annika Duggal</w:t>
+      </w:r>
+    </w:p>
+    <w:p>
+      <w:pPr>
         <w:numPr>
           <w:ilvl w:val="0"/>
           <w:numId w:val="1"/>
         </w:numPr>
-        <w:rPr/>
-      </w:pPr>
-      <w:r>
-        <w:rPr/>
-        <w:t>Student ID: __________________________________</w:t>
-      </w:r>
-    </w:p>
-    <w:p>
-      <w:pPr>
-        <w:pStyle w:val="Normal"/>
+      </w:pPr>
+      <w:r>
+        <w:t>Student ID:</w:t>
+      </w:r>
+      <w:r>
+        <w:t xml:space="preserve"> 101574406</w:t>
+      </w:r>
+    </w:p>
+    <w:p>
+      <w:pPr>
         <w:numPr>
           <w:ilvl w:val="0"/>
           <w:numId w:val="1"/>
         </w:numPr>
-        <w:rPr/>
-      </w:pPr>
-      <w:r>
-        <w:rPr/>
-        <w:t>Course Code: __________________________________</w:t>
-      </w:r>
-    </w:p>
-    <w:p>
-      <w:pPr>
-        <w:pStyle w:val="Normal"/>
-        <w:rPr/>
-      </w:pPr>
+      </w:pPr>
+      <w:r>
+        <w:t xml:space="preserve">Course Code: </w:t>
+      </w:r>
+      <w:r>
+        <w:t>COMP2152</w:t>
+      </w:r>
+    </w:p>
+    <w:p>
       <w:r>
         <w:rPr>
           <w:b/>
@@ -168,52 +140,44 @@
     </w:p>
     <w:p>
       <w:pPr>
-        <w:pStyle w:val="Normal"/>
         <w:numPr>
           <w:ilvl w:val="0"/>
           <w:numId w:val="2"/>
         </w:numPr>
-        <w:rPr/>
-      </w:pPr>
-      <w:r>
-        <w:rPr/>
-        <w:t>Assessment Name: __________________________________</w:t>
-      </w:r>
-    </w:p>
-    <w:p>
-      <w:pPr>
-        <w:pStyle w:val="Normal"/>
+      </w:pPr>
+      <w:r>
+        <w:t xml:space="preserve">Assessment Name: </w:t>
+      </w:r>
+      <w:r>
+        <w:t>Assignment2</w:t>
+      </w:r>
+    </w:p>
+    <w:p>
+      <w:pPr>
         <w:numPr>
           <w:ilvl w:val="0"/>
           <w:numId w:val="2"/>
         </w:numPr>
-        <w:rPr/>
-      </w:pPr>
-      <w:r>
-        <w:rPr/>
-        <w:t>Submission Date: _______________________________________</w:t>
-      </w:r>
-    </w:p>
-    <w:p>
-      <w:pPr>
-        <w:pStyle w:val="Normal"/>
-        <w:rPr>
-          <w:b/>
-          <w:bCs/>
-        </w:rPr>
-      </w:pPr>
-      <w:r>
-        <w:rPr>
-          <w:b/>
-          <w:bCs/>
-        </w:rPr>
-      </w:r>
-    </w:p>
-    <w:p>
-      <w:pPr>
-        <w:pStyle w:val="Normal"/>
-        <w:rPr>
-          <w:rFonts w:ascii="Aptos" w:hAnsi="Aptos" w:eastAsia="Aptos" w:cs="Aptos"/>
+      </w:pPr>
+      <w:r>
+        <w:t xml:space="preserve">Submission Date: </w:t>
+      </w:r>
+      <w:r>
+        <w:t>March 28, 2026</w:t>
+      </w:r>
+    </w:p>
+    <w:p>
+      <w:pPr>
+        <w:rPr>
+          <w:b/>
+          <w:bCs/>
+        </w:rPr>
+      </w:pPr>
+    </w:p>
+    <w:p>
+      <w:pPr>
+        <w:rPr>
+          <w:rFonts w:ascii="Aptos" w:eastAsia="Aptos" w:hAnsi="Aptos" w:cs="Aptos"/>
           <w:b/>
           <w:bCs/>
         </w:rPr>
@@ -229,9 +193,8 @@
     </w:p>
     <w:p>
       <w:pPr>
-        <w:pStyle w:val="Normal"/>
-        <w:rPr>
-          <w:rFonts w:ascii="Aptos" w:hAnsi="Aptos" w:eastAsia="Aptos" w:cs="Aptos"/>
+        <w:rPr>
+          <w:rFonts w:ascii="Aptos" w:eastAsia="Aptos" w:hAnsi="Aptos" w:cs="Aptos"/>
           <w:b/>
           <w:bCs/>
         </w:rPr>
@@ -252,17 +215,51 @@
           <w:ilvl w:val="0"/>
           <w:numId w:val="1"/>
         </w:numPr>
-        <w:spacing w:before="0" w:after="0"/>
-        <w:contextualSpacing/>
-        <w:rPr>
-          <w:rFonts w:ascii="Aptos" w:hAnsi="Aptos" w:eastAsia="Aptos" w:cs="Aptos"/>
-        </w:rPr>
-      </w:pPr>
+        <w:spacing w:after="0"/>
+        <w:rPr>
+          <w:rFonts w:ascii="Aptos" w:eastAsia="Aptos" w:hAnsi="Aptos" w:cs="Aptos"/>
+        </w:rPr>
+      </w:pPr>
+      <w:proofErr w:type="gramStart"/>
       <w:r>
         <w:rPr>
           <w:rFonts w:eastAsia="Aptos" w:cs="Aptos"/>
         </w:rPr>
         <w:t>ChatGPT</w:t>
+      </w:r>
+      <w:proofErr w:type="gramEnd"/>
+      <w:r>
+        <w:rPr>
+          <w:rFonts w:eastAsia="Aptos" w:cs="Aptos"/>
+        </w:rPr>
+        <w:tab/>
+      </w:r>
+      <w:r>
+        <w:rPr>
+          <w:rFonts w:eastAsia="Aptos" w:cs="Aptos"/>
+        </w:rPr>
+        <w:tab/>
+      </w:r>
+      <w:r>
+        <w:rPr>
+          <w:rFonts w:eastAsia="Aptos" w:cs="Aptos"/>
+        </w:rPr>
+        <w:tab/>
+      </w:r>
+      <w:r>
+        <w:rPr>
+          <w:rFonts w:eastAsia="Aptos" w:cs="Aptos"/>
+        </w:rPr>
+        <w:tab/>
+      </w:r>
+      <w:r>
+        <w:rPr>
+          <w:rFonts w:eastAsia="Aptos" w:cs="Aptos"/>
+          <w:i/>
+          <w:iCs/>
+          <w:highlight w:val="yellow"/>
+        </w:rPr>
+        <w:t>I did not use AI to complete this assignment</w:t>
       </w:r>
     </w:p>
     <w:p>
@@ -272,10 +269,9 @@
           <w:ilvl w:val="0"/>
           <w:numId w:val="1"/>
         </w:numPr>
-        <w:spacing w:before="0" w:after="0"/>
-        <w:contextualSpacing/>
-        <w:rPr>
-          <w:rFonts w:ascii="Aptos" w:hAnsi="Aptos" w:eastAsia="Aptos" w:cs="Aptos"/>
+        <w:spacing w:after="0"/>
+        <w:rPr>
+          <w:rFonts w:ascii="Aptos" w:eastAsia="Aptos" w:hAnsi="Aptos" w:cs="Aptos"/>
         </w:rPr>
       </w:pPr>
       <w:r>
@@ -292,10 +288,9 @@
           <w:ilvl w:val="0"/>
           <w:numId w:val="1"/>
         </w:numPr>
-        <w:spacing w:before="0" w:after="0"/>
-        <w:contextualSpacing/>
-        <w:rPr>
-          <w:rFonts w:ascii="Aptos" w:hAnsi="Aptos" w:eastAsia="Aptos" w:cs="Aptos"/>
+        <w:spacing w:after="0"/>
+        <w:rPr>
+          <w:rFonts w:ascii="Aptos" w:eastAsia="Aptos" w:hAnsi="Aptos" w:cs="Aptos"/>
         </w:rPr>
       </w:pPr>
       <w:r>
@@ -312,10 +307,9 @@
           <w:ilvl w:val="0"/>
           <w:numId w:val="1"/>
         </w:numPr>
-        <w:spacing w:before="0" w:after="0"/>
-        <w:contextualSpacing/>
-        <w:rPr>
-          <w:rFonts w:ascii="Aptos" w:hAnsi="Aptos" w:eastAsia="Aptos" w:cs="Aptos"/>
+        <w:spacing w:after="0"/>
+        <w:rPr>
+          <w:rFonts w:ascii="Aptos" w:eastAsia="Aptos" w:hAnsi="Aptos" w:cs="Aptos"/>
         </w:rPr>
       </w:pPr>
       <w:r>
@@ -325,32 +319,19 @@
         <w:t>Other: [Specify]</w:t>
       </w:r>
     </w:p>
-    <w:p>
-      <w:pPr>
-        <w:pStyle w:val="Normal"/>
-        <w:rPr/>
-      </w:pPr>
-      <w:r>
-        <w:rPr/>
-      </w:r>
-    </w:p>
-    <w:p>
-      <w:pPr>
-        <w:pStyle w:val="Normal"/>
-        <w:rPr/>
-      </w:pPr>
-      <w:r>
-        <w:rPr/>
-      </w:r>
-    </w:p>
-    <w:p>
-      <w:pPr>
-        <w:pStyle w:val="Normal"/>
-        <w:rPr/>
-      </w:pPr>
-      <w:r>
-        <w:rPr/>
-        <w:t>(form continues on next page)</w:t>
+    <w:p/>
+    <w:p/>
+    <w:p>
+      <w:r>
+        <w:t xml:space="preserve">(form </w:t>
+      </w:r>
+      <w:proofErr w:type="gramStart"/>
+      <w:r>
+        <w:t>continues on</w:t>
+      </w:r>
+      <w:proofErr w:type="gramEnd"/>
+      <w:r>
+        <w:t xml:space="preserve"> next page)</w:t>
       </w:r>
       <w:r>
         <w:br w:type="page"/>
@@ -360,22 +341,20 @@
       <w:pPr>
         <w:pStyle w:val="Heading4"/>
         <w:spacing w:before="319" w:after="319"/>
-        <w:rPr/>
-      </w:pPr>
-      <w:r>
-        <w:rPr>
-          <w:rFonts w:eastAsia="Aptos" w:cs="Aptos"/>
-          <w:b/>
-          <w:bCs/>
-        </w:rPr>
+      </w:pPr>
+      <w:r>
+        <w:rPr>
+          <w:rFonts w:eastAsia="Aptos" w:cs="Aptos"/>
+          <w:b/>
+          <w:bCs/>
+        </w:rPr>
+        <w:lastRenderedPageBreak/>
         <w:t>Purpose of AI Usage:</w:t>
       </w:r>
     </w:p>
     <w:p>
       <w:pPr>
-        <w:pStyle w:val="Normal"/>
         <w:spacing w:before="240" w:after="240"/>
-        <w:rPr/>
       </w:pPr>
       <w:r>
         <w:rPr>
@@ -391,10 +370,9 @@
           <w:ilvl w:val="0"/>
           <w:numId w:val="1"/>
         </w:numPr>
-        <w:spacing w:before="0" w:after="0"/>
-        <w:contextualSpacing/>
-        <w:rPr>
-          <w:rFonts w:ascii="Aptos" w:hAnsi="Aptos" w:eastAsia="Aptos" w:cs="Aptos"/>
+        <w:spacing w:after="0"/>
+        <w:rPr>
+          <w:rFonts w:ascii="Aptos" w:eastAsia="Aptos" w:hAnsi="Aptos" w:cs="Aptos"/>
         </w:rPr>
       </w:pPr>
       <w:r>
@@ -411,10 +389,9 @@
           <w:ilvl w:val="0"/>
           <w:numId w:val="1"/>
         </w:numPr>
-        <w:spacing w:before="0" w:after="0"/>
-        <w:contextualSpacing/>
-        <w:rPr>
-          <w:rFonts w:ascii="Aptos" w:hAnsi="Aptos" w:eastAsia="Aptos" w:cs="Aptos"/>
+        <w:spacing w:after="0"/>
+        <w:rPr>
+          <w:rFonts w:ascii="Aptos" w:eastAsia="Aptos" w:hAnsi="Aptos" w:cs="Aptos"/>
         </w:rPr>
       </w:pPr>
       <w:r>
@@ -431,10 +408,9 @@
           <w:ilvl w:val="0"/>
           <w:numId w:val="1"/>
         </w:numPr>
-        <w:spacing w:before="0" w:after="0"/>
-        <w:contextualSpacing/>
-        <w:rPr>
-          <w:rFonts w:ascii="Aptos" w:hAnsi="Aptos" w:eastAsia="Aptos" w:cs="Aptos"/>
+        <w:spacing w:after="0"/>
+        <w:rPr>
+          <w:rFonts w:ascii="Aptos" w:eastAsia="Aptos" w:hAnsi="Aptos" w:cs="Aptos"/>
         </w:rPr>
       </w:pPr>
       <w:r>
@@ -442,6 +418,39 @@
           <w:rFonts w:eastAsia="Aptos" w:cs="Aptos"/>
         </w:rPr>
         <w:t>Image Creation</w:t>
+      </w:r>
+      <w:r>
+        <w:rPr>
+          <w:rFonts w:eastAsia="Aptos" w:cs="Aptos"/>
+        </w:rPr>
+        <w:tab/>
+      </w:r>
+      <w:r>
+        <w:rPr>
+          <w:rFonts w:eastAsia="Aptos" w:cs="Aptos"/>
+        </w:rPr>
+        <w:tab/>
+      </w:r>
+      <w:r>
+        <w:rPr>
+          <w:rFonts w:eastAsia="Aptos" w:cs="Aptos"/>
+        </w:rPr>
+        <w:tab/>
+      </w:r>
+      <w:r>
+        <w:rPr>
+          <w:rFonts w:eastAsia="Aptos" w:cs="Aptos"/>
+        </w:rPr>
+        <w:tab/>
+      </w:r>
+      <w:r>
+        <w:rPr>
+          <w:rFonts w:eastAsia="Aptos" w:cs="Aptos"/>
+          <w:i/>
+          <w:iCs/>
+          <w:highlight w:val="yellow"/>
+        </w:rPr>
+        <w:t>I did not use AI to complete this assignment</w:t>
       </w:r>
     </w:p>
     <w:p>
@@ -451,10 +460,9 @@
           <w:ilvl w:val="0"/>
           <w:numId w:val="1"/>
         </w:numPr>
-        <w:spacing w:before="0" w:after="0"/>
-        <w:contextualSpacing/>
-        <w:rPr>
-          <w:rFonts w:ascii="Aptos" w:hAnsi="Aptos" w:eastAsia="Aptos" w:cs="Aptos"/>
+        <w:spacing w:after="0"/>
+        <w:rPr>
+          <w:rFonts w:ascii="Aptos" w:eastAsia="Aptos" w:hAnsi="Aptos" w:cs="Aptos"/>
         </w:rPr>
       </w:pPr>
       <w:r>
@@ -471,10 +479,9 @@
           <w:ilvl w:val="0"/>
           <w:numId w:val="1"/>
         </w:numPr>
-        <w:spacing w:before="0" w:after="0"/>
-        <w:contextualSpacing/>
-        <w:rPr>
-          <w:rFonts w:ascii="Aptos" w:hAnsi="Aptos" w:eastAsia="Aptos" w:cs="Aptos"/>
+        <w:spacing w:after="0"/>
+        <w:rPr>
+          <w:rFonts w:ascii="Aptos" w:eastAsia="Aptos" w:hAnsi="Aptos" w:cs="Aptos"/>
         </w:rPr>
       </w:pPr>
       <w:r>
@@ -491,10 +498,9 @@
           <w:ilvl w:val="0"/>
           <w:numId w:val="1"/>
         </w:numPr>
-        <w:spacing w:before="0" w:after="0"/>
-        <w:contextualSpacing/>
-        <w:rPr>
-          <w:rFonts w:ascii="Aptos" w:hAnsi="Aptos" w:eastAsia="Aptos" w:cs="Aptos"/>
+        <w:spacing w:after="0"/>
+        <w:rPr>
+          <w:rFonts w:ascii="Aptos" w:eastAsia="Aptos" w:hAnsi="Aptos" w:cs="Aptos"/>
         </w:rPr>
       </w:pPr>
       <w:r>
@@ -506,23 +512,16 @@
     </w:p>
     <w:p>
       <w:pPr>
-        <w:pStyle w:val="Normal"/>
-        <w:spacing w:before="0" w:after="0"/>
-        <w:rPr>
-          <w:rFonts w:ascii="Aptos" w:hAnsi="Aptos" w:eastAsia="Aptos" w:cs="Aptos"/>
-        </w:rPr>
-      </w:pPr>
-      <w:r>
-        <w:rPr>
-          <w:rFonts w:eastAsia="Aptos" w:cs="Aptos"/>
-        </w:rPr>
-      </w:r>
+        <w:spacing w:after="0"/>
+        <w:rPr>
+          <w:rFonts w:ascii="Aptos" w:eastAsia="Aptos" w:hAnsi="Aptos" w:cs="Aptos"/>
+        </w:rPr>
+      </w:pPr>
     </w:p>
     <w:p>
       <w:pPr>
         <w:pStyle w:val="Heading4"/>
         <w:spacing w:before="319" w:after="319"/>
-        <w:rPr/>
       </w:pPr>
       <w:r>
         <w:rPr>
@@ -535,21 +534,13 @@
     </w:p>
     <w:p>
       <w:pPr>
-        <w:pStyle w:val="Normal"/>
         <w:spacing w:before="240" w:after="240"/>
-        <w:rPr/>
-      </w:pPr>
-      <w:r>
-        <w:rPr>
-          <w:rFonts w:eastAsia="Aptos" w:cs="Aptos"/>
-        </w:rPr>
-        <w:t xml:space="preserve">(Provide brief examples or descriptions, </w:t>
-      </w:r>
-      <w:r>
-        <w:rPr>
-          <w:rFonts w:eastAsia="Aptos" w:cs="Aptos"/>
-        </w:rPr>
-        <w:t>adding more items to the below list if necessary</w:t>
+      </w:pPr>
+      <w:r>
+        <w:rPr>
+          <w:rFonts w:eastAsia="Aptos" w:cs="Aptos"/>
+        </w:rPr>
+        <w:t>(Provide brief examples or descriptions, adding more items to the below list if necessary</w:t>
       </w:r>
     </w:p>
     <w:p>
@@ -559,10 +550,9 @@
           <w:ilvl w:val="0"/>
           <w:numId w:val="1"/>
         </w:numPr>
-        <w:spacing w:before="0" w:after="0"/>
-        <w:contextualSpacing/>
-        <w:rPr>
-          <w:rFonts w:ascii="Aptos" w:hAnsi="Aptos" w:eastAsia="Aptos" w:cs="Aptos"/>
+        <w:spacing w:after="0"/>
+        <w:rPr>
+          <w:rFonts w:ascii="Aptos" w:eastAsia="Aptos" w:hAnsi="Aptos" w:cs="Aptos"/>
         </w:rPr>
       </w:pPr>
       <w:r>
@@ -587,10 +577,9 @@
           <w:ilvl w:val="0"/>
           <w:numId w:val="1"/>
         </w:numPr>
-        <w:spacing w:before="0" w:after="0"/>
-        <w:contextualSpacing/>
-        <w:rPr>
-          <w:rFonts w:ascii="Aptos" w:hAnsi="Aptos" w:eastAsia="Aptos" w:cs="Aptos"/>
+        <w:spacing w:after="0"/>
+        <w:rPr>
+          <w:rFonts w:ascii="Aptos" w:eastAsia="Aptos" w:hAnsi="Aptos" w:cs="Aptos"/>
         </w:rPr>
       </w:pPr>
       <w:r>
@@ -610,23 +599,46 @@
     </w:p>
     <w:p>
       <w:pPr>
-        <w:pStyle w:val="Normal"/>
-        <w:spacing w:before="0" w:after="0"/>
-        <w:rPr>
-          <w:rFonts w:ascii="Aptos" w:hAnsi="Aptos" w:eastAsia="Aptos" w:cs="Aptos"/>
-        </w:rPr>
-      </w:pPr>
-      <w:r>
-        <w:rPr>
-          <w:rFonts w:eastAsia="Aptos" w:cs="Aptos"/>
-        </w:rPr>
-      </w:r>
+        <w:spacing w:after="0"/>
+        <w:rPr>
+          <w:rFonts w:eastAsia="Aptos" w:cs="Aptos"/>
+          <w:i/>
+          <w:iCs/>
+          <w:highlight w:val="yellow"/>
+        </w:rPr>
+      </w:pPr>
+    </w:p>
+    <w:p>
+      <w:pPr>
+        <w:spacing w:after="0"/>
+        <w:ind w:left="4320" w:firstLine="720"/>
+        <w:rPr>
+          <w:rFonts w:ascii="Aptos" w:eastAsia="Aptos" w:hAnsi="Aptos" w:cs="Aptos"/>
+        </w:rPr>
+      </w:pPr>
+      <w:r>
+        <w:rPr>
+          <w:rFonts w:eastAsia="Aptos" w:cs="Aptos"/>
+          <w:i/>
+          <w:iCs/>
+          <w:highlight w:val="yellow"/>
+        </w:rPr>
+        <w:t>I did not use AI to complete this assignment</w:t>
+      </w:r>
+    </w:p>
+    <w:p>
+      <w:pPr>
+        <w:spacing w:after="0"/>
+        <w:ind w:left="360"/>
+        <w:rPr>
+          <w:rFonts w:ascii="Aptos" w:eastAsia="Aptos" w:hAnsi="Aptos" w:cs="Aptos"/>
+        </w:rPr>
+      </w:pPr>
     </w:p>
     <w:p>
       <w:pPr>
         <w:pStyle w:val="Heading4"/>
         <w:spacing w:before="319" w:after="319"/>
-        <w:rPr/>
       </w:pPr>
       <w:r>
         <w:rPr>
@@ -639,9 +651,7 @@
     </w:p>
     <w:p>
       <w:pPr>
-        <w:pStyle w:val="Normal"/>
         <w:spacing w:before="240" w:after="240"/>
-        <w:rPr/>
       </w:pPr>
       <w:r>
         <w:rPr>
@@ -657,10 +667,9 @@
           <w:ilvl w:val="0"/>
           <w:numId w:val="1"/>
         </w:numPr>
-        <w:spacing w:before="0" w:after="0"/>
-        <w:contextualSpacing/>
-        <w:rPr>
-          <w:rFonts w:ascii="Aptos" w:hAnsi="Aptos" w:eastAsia="Aptos" w:cs="Aptos"/>
+        <w:spacing w:after="0"/>
+        <w:rPr>
+          <w:rFonts w:ascii="Aptos" w:eastAsia="Aptos" w:hAnsi="Aptos" w:cs="Aptos"/>
         </w:rPr>
       </w:pPr>
       <w:r>
@@ -677,10 +686,9 @@
           <w:ilvl w:val="0"/>
           <w:numId w:val="1"/>
         </w:numPr>
-        <w:spacing w:before="0" w:after="0"/>
-        <w:contextualSpacing/>
-        <w:rPr>
-          <w:rFonts w:ascii="Aptos" w:hAnsi="Aptos" w:eastAsia="Aptos" w:cs="Aptos"/>
+        <w:spacing w:after="0"/>
+        <w:rPr>
+          <w:rFonts w:ascii="Aptos" w:eastAsia="Aptos" w:hAnsi="Aptos" w:cs="Aptos"/>
         </w:rPr>
       </w:pPr>
       <w:r>
@@ -697,10 +705,9 @@
           <w:ilvl w:val="0"/>
           <w:numId w:val="1"/>
         </w:numPr>
-        <w:spacing w:before="0" w:after="0"/>
-        <w:contextualSpacing/>
-        <w:rPr>
-          <w:rFonts w:ascii="Aptos" w:hAnsi="Aptos" w:eastAsia="Aptos" w:cs="Aptos"/>
+        <w:spacing w:after="0"/>
+        <w:rPr>
+          <w:rFonts w:ascii="Aptos" w:eastAsia="Aptos" w:hAnsi="Aptos" w:cs="Aptos"/>
         </w:rPr>
       </w:pPr>
       <w:r>
@@ -717,10 +724,9 @@
           <w:ilvl w:val="0"/>
           <w:numId w:val="1"/>
         </w:numPr>
-        <w:spacing w:before="0" w:after="0"/>
-        <w:contextualSpacing/>
-        <w:rPr>
-          <w:rFonts w:ascii="Aptos" w:hAnsi="Aptos" w:eastAsia="Aptos" w:cs="Aptos"/>
+        <w:spacing w:after="0"/>
+        <w:rPr>
+          <w:rFonts w:ascii="Aptos" w:eastAsia="Aptos" w:hAnsi="Aptos" w:cs="Aptos"/>
         </w:rPr>
       </w:pPr>
       <w:r>
@@ -732,42 +738,41 @@
     </w:p>
     <w:p>
       <w:pPr>
-        <w:pStyle w:val="Normal"/>
-        <w:rPr>
-          <w:b/>
-          <w:bCs/>
-        </w:rPr>
-      </w:pPr>
-      <w:r>
-        <w:rPr>
-          <w:b/>
-          <w:bCs/>
-        </w:rPr>
-      </w:r>
-    </w:p>
-    <w:p>
-      <w:pPr>
-        <w:pStyle w:val="Normal"/>
-        <w:rPr>
-          <w:b/>
-          <w:bCs/>
-        </w:rPr>
-      </w:pPr>
-      <w:r>
-        <w:rPr>
-          <w:b/>
-          <w:bCs/>
-        </w:rPr>
-      </w:r>
-    </w:p>
-    <w:p>
-      <w:pPr>
-        <w:pStyle w:val="Normal"/>
-        <w:rPr/>
-      </w:pPr>
-      <w:r>
-        <w:rPr/>
-        <w:t>(form continues on next page)</w:t>
+        <w:spacing w:after="0"/>
+        <w:ind w:left="3600" w:firstLine="720"/>
+        <w:rPr>
+          <w:rFonts w:ascii="Aptos" w:eastAsia="Aptos" w:hAnsi="Aptos" w:cs="Aptos"/>
+        </w:rPr>
+      </w:pPr>
+      <w:r>
+        <w:rPr>
+          <w:rFonts w:eastAsia="Aptos" w:cs="Aptos"/>
+          <w:i/>
+          <w:iCs/>
+          <w:highlight w:val="yellow"/>
+        </w:rPr>
+        <w:t>I did not use AI to complete this assignment</w:t>
+      </w:r>
+    </w:p>
+    <w:p>
+      <w:pPr>
+        <w:rPr>
+          <w:b/>
+          <w:bCs/>
+        </w:rPr>
+      </w:pPr>
+    </w:p>
+    <w:p>
+      <w:r>
+        <w:t xml:space="preserve">(form </w:t>
+      </w:r>
+      <w:proofErr w:type="gramStart"/>
+      <w:r>
+        <w:t>continues on</w:t>
+      </w:r>
+      <w:proofErr w:type="gramEnd"/>
+      <w:r>
+        <w:t xml:space="preserve"> next page)</w:t>
       </w:r>
       <w:r>
         <w:br w:type="page"/>
@@ -777,22 +782,20 @@
       <w:pPr>
         <w:pStyle w:val="Heading4"/>
         <w:spacing w:before="319" w:after="319"/>
-        <w:rPr/>
-      </w:pPr>
-      <w:r>
-        <w:rPr>
-          <w:rFonts w:eastAsia="Aptos" w:cs="Aptos"/>
-          <w:b/>
-          <w:bCs/>
-        </w:rPr>
+      </w:pPr>
+      <w:r>
+        <w:rPr>
+          <w:rFonts w:eastAsia="Aptos" w:cs="Aptos"/>
+          <w:b/>
+          <w:bCs/>
+        </w:rPr>
+        <w:lastRenderedPageBreak/>
         <w:t>Quality Assurance and Ethical Considerations:</w:t>
       </w:r>
     </w:p>
     <w:p>
       <w:pPr>
-        <w:pStyle w:val="Normal"/>
         <w:spacing w:before="240" w:after="240"/>
-        <w:rPr/>
       </w:pPr>
       <w:r>
         <w:rPr>
@@ -803,9 +806,7 @@
     </w:p>
     <w:p>
       <w:pPr>
-        <w:pStyle w:val="Normal"/>
         <w:spacing w:before="240" w:after="240"/>
-        <w:rPr/>
       </w:pPr>
       <w:r>
         <w:rPr>
@@ -824,9 +825,7 @@
     </w:p>
     <w:p>
       <w:pPr>
-        <w:pStyle w:val="Normal"/>
         <w:spacing w:before="240" w:after="240"/>
-        <w:rPr/>
       </w:pPr>
       <w:r>
         <w:rPr>
@@ -845,24 +844,33 @@
     </w:p>
     <w:p>
       <w:pPr>
-        <w:pStyle w:val="Normal"/>
-        <w:rPr>
-          <w:b/>
-          <w:bCs/>
-        </w:rPr>
-      </w:pPr>
-      <w:r>
-        <w:rPr>
-          <w:b/>
-          <w:bCs/>
-        </w:rPr>
-      </w:r>
+        <w:spacing w:after="0"/>
+        <w:rPr>
+          <w:rFonts w:ascii="Aptos" w:eastAsia="Aptos" w:hAnsi="Aptos" w:cs="Aptos"/>
+        </w:rPr>
+      </w:pPr>
+      <w:r>
+        <w:rPr>
+          <w:rFonts w:eastAsia="Aptos" w:cs="Aptos"/>
+          <w:i/>
+          <w:iCs/>
+          <w:highlight w:val="yellow"/>
+        </w:rPr>
+        <w:t>I did not use AI to complete this assignment</w:t>
+      </w:r>
+    </w:p>
+    <w:p>
+      <w:pPr>
+        <w:rPr>
+          <w:b/>
+          <w:bCs/>
+        </w:rPr>
+      </w:pPr>
     </w:p>
     <w:p>
       <w:pPr>
         <w:pStyle w:val="Heading4"/>
         <w:spacing w:before="319" w:after="319"/>
-        <w:rPr/>
       </w:pPr>
       <w:r>
         <w:rPr>
@@ -875,9 +883,7 @@
     </w:p>
     <w:p>
       <w:pPr>
-        <w:pStyle w:val="Normal"/>
         <w:spacing w:before="240" w:after="240"/>
-        <w:rPr/>
       </w:pPr>
       <w:r>
         <w:rPr>
@@ -888,9 +894,7 @@
     </w:p>
     <w:p>
       <w:pPr>
-        <w:pStyle w:val="Normal"/>
         <w:spacing w:before="240" w:after="240"/>
-        <w:rPr/>
       </w:pPr>
       <w:r>
         <w:rPr>
@@ -909,39 +913,30 @@
     </w:p>
     <w:p>
       <w:pPr>
-        <w:pStyle w:val="Normal"/>
-        <w:rPr>
-          <w:b/>
-          <w:bCs/>
-        </w:rPr>
-      </w:pPr>
-      <w:r>
-        <w:rPr>
-          <w:b/>
-          <w:bCs/>
-        </w:rPr>
-      </w:r>
-    </w:p>
-    <w:p>
-      <w:pPr>
-        <w:pStyle w:val="Normal"/>
-        <w:rPr>
-          <w:b/>
-          <w:bCs/>
-        </w:rPr>
-      </w:pPr>
-      <w:r>
-        <w:rPr>
-          <w:b/>
-          <w:bCs/>
-        </w:rPr>
-      </w:r>
-    </w:p>
-    <w:p>
-      <w:pPr>
-        <w:pStyle w:val="Normal"/>
-        <w:rPr/>
-      </w:pPr>
+        <w:spacing w:after="0"/>
+        <w:rPr>
+          <w:rFonts w:ascii="Aptos" w:eastAsia="Aptos" w:hAnsi="Aptos" w:cs="Aptos"/>
+        </w:rPr>
+      </w:pPr>
+      <w:r>
+        <w:rPr>
+          <w:rFonts w:eastAsia="Aptos" w:cs="Aptos"/>
+          <w:i/>
+          <w:iCs/>
+          <w:highlight w:val="yellow"/>
+        </w:rPr>
+        <w:t>I did not use AI to complete this assignment</w:t>
+      </w:r>
+    </w:p>
+    <w:p>
+      <w:pPr>
+        <w:rPr>
+          <w:b/>
+          <w:bCs/>
+        </w:rPr>
+      </w:pPr>
+    </w:p>
+    <w:p>
       <w:r>
         <w:rPr>
           <w:b/>
@@ -951,10 +946,6 @@
       </w:r>
     </w:p>
     <w:p>
-      <w:pPr>
-        <w:pStyle w:val="Normal"/>
-        <w:rPr/>
-      </w:pPr>
       <w:r>
         <w:rPr>
           <w:rFonts w:eastAsia="Aptos" w:cs="Aptos"/>
@@ -967,7 +958,7 @@
           <w:b/>
           <w:bCs/>
         </w:rPr>
-        <w:t>Your Full Name</w:t>
+        <w:t>Annika Duggal</w:t>
       </w:r>
       <w:r>
         <w:rPr>
@@ -981,7 +972,7 @@
           <w:b/>
           <w:bCs/>
         </w:rPr>
-        <w:t>Student ID</w:t>
+        <w:t>101574406</w:t>
       </w:r>
       <w:r>
         <w:rPr>
@@ -992,9 +983,7 @@
     </w:p>
     <w:p>
       <w:pPr>
-        <w:pStyle w:val="Normal"/>
         <w:ind w:left="720"/>
-        <w:rPr/>
       </w:pPr>
       <w:r>
         <w:rPr>
@@ -1006,61 +995,44 @@
     </w:p>
     <w:p>
       <w:pPr>
-        <w:pStyle w:val="Normal"/>
         <w:numPr>
           <w:ilvl w:val="0"/>
           <w:numId w:val="3"/>
         </w:numPr>
-        <w:rPr/>
-      </w:pPr>
-      <w:r>
-        <w:rPr/>
+      </w:pPr>
+      <w:r>
         <w:t>I declare that the work submitted is my own and that AI was used only as a tool to assist me in its completion.</w:t>
       </w:r>
     </w:p>
     <w:p>
       <w:pPr>
-        <w:pStyle w:val="Normal"/>
         <w:numPr>
           <w:ilvl w:val="0"/>
           <w:numId w:val="3"/>
         </w:numPr>
-        <w:rPr/>
-      </w:pPr>
-      <w:r>
-        <w:rPr/>
+      </w:pPr>
+      <w:r>
         <w:t>I understand that I am responsible for the content and quality of the work submitted, even if AI was used to generate parts of it.</w:t>
       </w:r>
     </w:p>
-    <w:p>
-      <w:pPr>
-        <w:pStyle w:val="Normal"/>
-        <w:widowControl/>
-        <w:bidi w:val="0"/>
-        <w:spacing w:lineRule="auto" w:line="259" w:before="0" w:after="160"/>
-        <w:jc w:val="left"/>
-        <w:rPr/>
-      </w:pPr>
-      <w:r>
-        <w:rPr/>
-      </w:r>
-    </w:p>
+    <w:p/>
     <w:sectPr>
-      <w:type w:val="nextPage"/>
       <w:pgSz w:w="12240" w:h="15840"/>
-      <w:pgMar w:left="1440" w:right="1440" w:gutter="0" w:header="0" w:top="1440" w:footer="0" w:bottom="1440"/>
-      <w:pgNumType w:fmt="decimal"/>
-      <w:formProt w:val="false"/>
-      <w:textDirection w:val="lrTb"/>
-      <w:docGrid w:type="default" w:linePitch="360" w:charSpace="4096"/>
+      <w:pgMar w:top="1440" w:right="1440" w:bottom="1440" w:left="1440" w:header="0" w:footer="0" w:gutter="0"/>
+      <w:cols w:space="720"/>
+      <w:formProt w:val="0"/>
+      <w:docGrid w:linePitch="360" w:charSpace="4096"/>
     </w:sectPr>
   </w:body>
 </w:document>
 </file>
 
 <file path=word/numbering.xml><?xml version="1.0" encoding="utf-8"?>
-<w:numbering xmlns:w="http://schemas.openxmlformats.org/wordprocessingml/2006/main" xmlns:o="urn:schemas-microsoft-com:office:office" xmlns:r="http://schemas.openxmlformats.org/officeDocument/2006/relationships" xmlns:v="urn:schemas-microsoft-com:vml" xmlns:mc="http://schemas.openxmlformats.org/markup-compatibility/2006" xmlns:w14="http://schemas.microsoft.com/office/word/2010/wordml" mc:Ignorable="w14">
-  <w:abstractNum w:abstractNumId="1">
+<w:numbering xmlns:wpc="http://schemas.microsoft.com/office/word/2010/wordprocessingCanvas" xmlns:cx="http://schemas.microsoft.com/office/drawing/2014/chartex" xmlns:cx1="http://schemas.microsoft.com/office/drawing/2015/9/8/chartex" xmlns:cx2="http://schemas.microsoft.com/office/drawing/2015/10/21/chartex" xmlns:cx3="http://schemas.microsoft.com/office/drawing/2016/5/9/chartex" xmlns:cx4="http://schemas.microsoft.com/office/drawing/2016/5/10/chartex" xmlns:cx5="http://schemas.microsoft.com/office/drawing/2016/5/11/chartex" xmlns:cx6="http://schemas.microsoft.com/office/drawing/2016/5/12/chartex" xmlns:cx7="http://schemas.microsoft.com/office/drawing/2016/5/13/chartex" xmlns:cx8="http://schemas.microsoft.com/office/drawing/2016/5/14/chartex" xmlns:mc="http://schemas.openxmlformats.org/markup-compatibility/2006" xmlns:aink="http://schemas.microsoft.com/office/drawing/2016/ink" xmlns:am3d="http://schemas.microsoft.com/office/drawing/2017/model3d" xmlns:o="urn:schemas-microsoft-com:office:office" xmlns:oel="http://schemas.microsoft.com/office/2019/extlst" xmlns:r="http://schemas.openxmlformats.org/officeDocument/2006/relationships" xmlns:m="http://schemas.openxmlformats.org/officeDocument/2006/math" xmlns:v="urn:schemas-microsoft-com:vml" xmlns:wp14="http://schemas.microsoft.com/office/word/2010/wordprocessingDrawing" xmlns:wp="http://schemas.openxmlformats.org/drawingml/2006/wordprocessingDrawing" xmlns:w10="urn:schemas-microsoft-com:office:word" xmlns:w="http://schemas.openxmlformats.org/wordprocessingml/2006/main" xmlns:w14="http://schemas.microsoft.com/office/word/2010/wordml" xmlns:w15="http://schemas.microsoft.com/office/word/2012/wordml" xmlns:w16cex="http://schemas.microsoft.com/office/word/2018/wordml/cex" xmlns:w16cid="http://schemas.microsoft.com/office/word/2016/wordml/cid" xmlns:w16="http://schemas.microsoft.com/office/word/2018/wordml" xmlns:w16du="http://schemas.microsoft.com/office/word/2023/wordml/word16du" xmlns:w16sdtdh="http://schemas.microsoft.com/office/word/2020/wordml/sdtdatahash" xmlns:w16sdtfl="http://schemas.microsoft.com/office/word/2024/wordml/sdtformatlock" xmlns:w16se="http://schemas.microsoft.com/office/word/2015/wordml/symex" xmlns:wpg="http://schemas.microsoft.com/office/word/2010/wordprocessingGroup" xmlns:wpi="http://schemas.microsoft.com/office/word/2010/wordprocessingInk" xmlns:wne="http://schemas.microsoft.com/office/word/2006/wordml" xmlns:wps="http://schemas.microsoft.com/office/word/2010/wordprocessingShape" mc:Ignorable="w14 w15 w16se w16cid w16 w16cex w16sdtdh w16sdtfl w16du wp14">
+  <w:abstractNum w:abstractNumId="0" w15:restartNumberingAfterBreak="0">
+    <w:nsid w:val="166312AC"/>
+    <w:multiLevelType w:val="multilevel"/>
+    <w:tmpl w:val="E72298AC"/>
     <w:lvl w:ilvl="0">
       <w:start w:val="1"/>
       <w:numFmt w:val="bullet"/>
@@ -1206,7 +1178,10 @@
       </w:rPr>
     </w:lvl>
   </w:abstractNum>
-  <w:abstractNum w:abstractNumId="2">
+  <w:abstractNum w:abstractNumId="1" w15:restartNumberingAfterBreak="0">
+    <w:nsid w:val="1930732E"/>
+    <w:multiLevelType w:val="multilevel"/>
+    <w:tmpl w:val="D514EA64"/>
     <w:lvl w:ilvl="0">
       <w:start w:val="1"/>
       <w:numFmt w:val="bullet"/>
@@ -1352,7 +1327,10 @@
       </w:rPr>
     </w:lvl>
   </w:abstractNum>
-  <w:abstractNum w:abstractNumId="3">
+  <w:abstractNum w:abstractNumId="2" w15:restartNumberingAfterBreak="0">
+    <w:nsid w:val="41854509"/>
+    <w:multiLevelType w:val="multilevel"/>
+    <w:tmpl w:val="7556CE00"/>
     <w:lvl w:ilvl="0">
       <w:start w:val="1"/>
       <w:numFmt w:val="bullet"/>
@@ -1498,7 +1476,10 @@
       </w:rPr>
     </w:lvl>
   </w:abstractNum>
-  <w:abstractNum w:abstractNumId="4">
+  <w:abstractNum w:abstractNumId="3" w15:restartNumberingAfterBreak="0">
+    <w:nsid w:val="6F124D50"/>
+    <w:multiLevelType w:val="multilevel"/>
+    <w:tmpl w:val="58C6241C"/>
     <w:lvl w:ilvl="0">
       <w:start w:val="1"/>
       <w:numFmt w:val="none"/>
@@ -1509,7 +1490,7 @@
         <w:tabs>
           <w:tab w:val="num" w:pos="0"/>
         </w:tabs>
-        <w:ind w:left="0" w:hanging="0"/>
+        <w:ind w:left="0" w:firstLine="0"/>
       </w:pPr>
     </w:lvl>
     <w:lvl w:ilvl="1">
@@ -1522,7 +1503,7 @@
         <w:tabs>
           <w:tab w:val="num" w:pos="0"/>
         </w:tabs>
-        <w:ind w:left="0" w:hanging="0"/>
+        <w:ind w:left="0" w:firstLine="0"/>
       </w:pPr>
     </w:lvl>
     <w:lvl w:ilvl="2">
@@ -1535,7 +1516,7 @@
         <w:tabs>
           <w:tab w:val="num" w:pos="0"/>
         </w:tabs>
-        <w:ind w:left="0" w:hanging="0"/>
+        <w:ind w:left="0" w:firstLine="0"/>
       </w:pPr>
     </w:lvl>
     <w:lvl w:ilvl="3">
@@ -1548,7 +1529,7 @@
         <w:tabs>
           <w:tab w:val="num" w:pos="0"/>
         </w:tabs>
-        <w:ind w:left="0" w:hanging="0"/>
+        <w:ind w:left="0" w:firstLine="0"/>
       </w:pPr>
     </w:lvl>
     <w:lvl w:ilvl="4">
@@ -1561,7 +1542,7 @@
         <w:tabs>
           <w:tab w:val="num" w:pos="0"/>
         </w:tabs>
-        <w:ind w:left="0" w:hanging="0"/>
+        <w:ind w:left="0" w:firstLine="0"/>
       </w:pPr>
     </w:lvl>
     <w:lvl w:ilvl="5">
@@ -1574,7 +1555,7 @@
         <w:tabs>
           <w:tab w:val="num" w:pos="0"/>
         </w:tabs>
-        <w:ind w:left="0" w:hanging="0"/>
+        <w:ind w:left="0" w:firstLine="0"/>
       </w:pPr>
     </w:lvl>
     <w:lvl w:ilvl="6">
@@ -1587,7 +1568,7 @@
         <w:tabs>
           <w:tab w:val="num" w:pos="0"/>
         </w:tabs>
-        <w:ind w:left="0" w:hanging="0"/>
+        <w:ind w:left="0" w:firstLine="0"/>
       </w:pPr>
     </w:lvl>
     <w:lvl w:ilvl="7">
@@ -1600,7 +1581,7 @@
         <w:tabs>
           <w:tab w:val="num" w:pos="0"/>
         </w:tabs>
-        <w:ind w:left="0" w:hanging="0"/>
+        <w:ind w:left="0" w:firstLine="0"/>
       </w:pPr>
     </w:lvl>
     <w:lvl w:ilvl="8">
@@ -1613,31 +1594,31 @@
         <w:tabs>
           <w:tab w:val="num" w:pos="0"/>
         </w:tabs>
-        <w:ind w:left="0" w:hanging="0"/>
+        <w:ind w:left="0" w:firstLine="0"/>
       </w:pPr>
     </w:lvl>
   </w:abstractNum>
-  <w:num w:numId="1">
+  <w:num w:numId="1" w16cid:durableId="2053799800">
+    <w:abstractNumId w:val="0"/>
+  </w:num>
+  <w:num w:numId="2" w16cid:durableId="1624920173">
     <w:abstractNumId w:val="1"/>
   </w:num>
-  <w:num w:numId="2">
+  <w:num w:numId="3" w16cid:durableId="1903902509">
     <w:abstractNumId w:val="2"/>
   </w:num>
-  <w:num w:numId="3">
+  <w:num w:numId="4" w16cid:durableId="577135446">
     <w:abstractNumId w:val="3"/>
-  </w:num>
-  <w:num w:numId="4">
-    <w:abstractNumId w:val="4"/>
   </w:num>
 </w:numbering>
 </file>
 
 <file path=word/styles.xml><?xml version="1.0" encoding="utf-8"?>
-<w:styles xmlns:w="http://schemas.openxmlformats.org/wordprocessingml/2006/main" xmlns:w14="http://schemas.microsoft.com/office/word/2010/wordml" xmlns:mc="http://schemas.openxmlformats.org/markup-compatibility/2006" mc:Ignorable="w14">
+<w:styles xmlns:mc="http://schemas.openxmlformats.org/markup-compatibility/2006" xmlns:r="http://schemas.openxmlformats.org/officeDocument/2006/relationships" xmlns:w="http://schemas.openxmlformats.org/wordprocessingml/2006/main" xmlns:w14="http://schemas.microsoft.com/office/word/2010/wordml" xmlns:w15="http://schemas.microsoft.com/office/word/2012/wordml" xmlns:w16cex="http://schemas.microsoft.com/office/word/2018/wordml/cex" xmlns:w16cid="http://schemas.microsoft.com/office/word/2016/wordml/cid" xmlns:w16="http://schemas.microsoft.com/office/word/2018/wordml" xmlns:w16du="http://schemas.microsoft.com/office/word/2023/wordml/word16du" xmlns:w16sdtdh="http://schemas.microsoft.com/office/word/2020/wordml/sdtdatahash" xmlns:w16sdtfl="http://schemas.microsoft.com/office/word/2024/wordml/sdtformatlock" xmlns:w16se="http://schemas.microsoft.com/office/word/2015/wordml/symex" mc:Ignorable="w14 w15 w16se w16cid w16 w16cex w16sdtdh w16sdtfl w16du">
   <w:docDefaults>
     <w:rPrDefault>
       <w:rPr>
-        <w:rFonts w:ascii="Aptos" w:hAnsi="Aptos" w:eastAsia="Aptos" w:cs="Arial" w:asciiTheme="minorHAnsi" w:cstheme="minorBidi" w:eastAsiaTheme="minorHAnsi" w:hAnsiTheme="minorHAnsi"/>
+        <w:rFonts w:asciiTheme="minorHAnsi" w:eastAsiaTheme="minorHAnsi" w:hAnsiTheme="minorHAnsi" w:cstheme="minorBidi"/>
         <w:sz w:val="22"/>
         <w:szCs w:val="22"/>
         <w:lang w:val="en-CA" w:eastAsia="en-US" w:bidi="ar-SA"/>
@@ -1645,21 +1626,21 @@
     </w:rPrDefault>
     <w:pPrDefault>
       <w:pPr>
-        <w:suppressAutoHyphens w:val="true"/>
+        <w:suppressAutoHyphens/>
       </w:pPr>
     </w:pPrDefault>
   </w:docDefaults>
   <w:latentStyles w:defLockedState="0" w:defUIPriority="99" w:defSemiHidden="0" w:defUnhideWhenUsed="0" w:defQFormat="0" w:count="376">
     <w:lsdException w:name="Normal" w:uiPriority="0" w:qFormat="1"/>
     <w:lsdException w:name="heading 1" w:uiPriority="9" w:qFormat="1"/>
-    <w:lsdException w:name="heading 2" w:uiPriority="9" w:semiHidden="1" w:unhideWhenUsed="1" w:qFormat="1"/>
-    <w:lsdException w:name="heading 3" w:uiPriority="9" w:semiHidden="1" w:unhideWhenUsed="1" w:qFormat="1"/>
-    <w:lsdException w:name="heading 4" w:uiPriority="9" w:semiHidden="1" w:unhideWhenUsed="1" w:qFormat="1"/>
-    <w:lsdException w:name="heading 5" w:uiPriority="9" w:semiHidden="1" w:unhideWhenUsed="1" w:qFormat="1"/>
-    <w:lsdException w:name="heading 6" w:uiPriority="9" w:semiHidden="1" w:unhideWhenUsed="1" w:qFormat="1"/>
-    <w:lsdException w:name="heading 7" w:uiPriority="9" w:semiHidden="1" w:unhideWhenUsed="1" w:qFormat="1"/>
-    <w:lsdException w:name="heading 8" w:uiPriority="9" w:semiHidden="1" w:unhideWhenUsed="1" w:qFormat="1"/>
-    <w:lsdException w:name="heading 9" w:uiPriority="9" w:semiHidden="1" w:unhideWhenUsed="1" w:qFormat="1"/>
+    <w:lsdException w:name="heading 2" w:semiHidden="1" w:uiPriority="9" w:unhideWhenUsed="1" w:qFormat="1"/>
+    <w:lsdException w:name="heading 3" w:semiHidden="1" w:uiPriority="9" w:unhideWhenUsed="1" w:qFormat="1"/>
+    <w:lsdException w:name="heading 4" w:semiHidden="1" w:uiPriority="9" w:unhideWhenUsed="1" w:qFormat="1"/>
+    <w:lsdException w:name="heading 5" w:semiHidden="1" w:uiPriority="9" w:unhideWhenUsed="1" w:qFormat="1"/>
+    <w:lsdException w:name="heading 6" w:semiHidden="1" w:uiPriority="9" w:unhideWhenUsed="1" w:qFormat="1"/>
+    <w:lsdException w:name="heading 7" w:semiHidden="1" w:uiPriority="9" w:unhideWhenUsed="1" w:qFormat="1"/>
+    <w:lsdException w:name="heading 8" w:semiHidden="1" w:uiPriority="9" w:unhideWhenUsed="1" w:qFormat="1"/>
+    <w:lsdException w:name="heading 9" w:semiHidden="1" w:uiPriority="9" w:unhideWhenUsed="1" w:qFormat="1"/>
     <w:lsdException w:name="index 1" w:semiHidden="1" w:unhideWhenUsed="1"/>
     <w:lsdException w:name="index 2" w:semiHidden="1" w:unhideWhenUsed="1"/>
     <w:lsdException w:name="index 3" w:semiHidden="1" w:unhideWhenUsed="1"/>
@@ -1669,22 +1650,22 @@
     <w:lsdException w:name="index 7" w:semiHidden="1" w:unhideWhenUsed="1"/>
     <w:lsdException w:name="index 8" w:semiHidden="1" w:unhideWhenUsed="1"/>
     <w:lsdException w:name="index 9" w:semiHidden="1" w:unhideWhenUsed="1"/>
-    <w:lsdException w:name="toc 1" w:uiPriority="39" w:semiHidden="1" w:unhideWhenUsed="1"/>
-    <w:lsdException w:name="toc 2" w:uiPriority="39" w:semiHidden="1" w:unhideWhenUsed="1"/>
-    <w:lsdException w:name="toc 3" w:uiPriority="39" w:semiHidden="1" w:unhideWhenUsed="1"/>
-    <w:lsdException w:name="toc 4" w:uiPriority="39" w:semiHidden="1" w:unhideWhenUsed="1"/>
-    <w:lsdException w:name="toc 5" w:uiPriority="39" w:semiHidden="1" w:unhideWhenUsed="1"/>
-    <w:lsdException w:name="toc 6" w:uiPriority="39" w:semiHidden="1" w:unhideWhenUsed="1"/>
-    <w:lsdException w:name="toc 7" w:uiPriority="39" w:semiHidden="1" w:unhideWhenUsed="1"/>
-    <w:lsdException w:name="toc 8" w:uiPriority="39" w:semiHidden="1" w:unhideWhenUsed="1"/>
-    <w:lsdException w:name="toc 9" w:uiPriority="39" w:semiHidden="1" w:unhideWhenUsed="1"/>
+    <w:lsdException w:name="toc 1" w:semiHidden="1" w:uiPriority="39" w:unhideWhenUsed="1"/>
+    <w:lsdException w:name="toc 2" w:semiHidden="1" w:uiPriority="39" w:unhideWhenUsed="1"/>
+    <w:lsdException w:name="toc 3" w:semiHidden="1" w:uiPriority="39" w:unhideWhenUsed="1"/>
+    <w:lsdException w:name="toc 4" w:semiHidden="1" w:uiPriority="39" w:unhideWhenUsed="1"/>
+    <w:lsdException w:name="toc 5" w:semiHidden="1" w:uiPriority="39" w:unhideWhenUsed="1"/>
+    <w:lsdException w:name="toc 6" w:semiHidden="1" w:uiPriority="39" w:unhideWhenUsed="1"/>
+    <w:lsdException w:name="toc 7" w:semiHidden="1" w:uiPriority="39" w:unhideWhenUsed="1"/>
+    <w:lsdException w:name="toc 8" w:semiHidden="1" w:uiPriority="39" w:unhideWhenUsed="1"/>
+    <w:lsdException w:name="toc 9" w:semiHidden="1" w:uiPriority="39" w:unhideWhenUsed="1"/>
     <w:lsdException w:name="Normal Indent" w:semiHidden="1" w:unhideWhenUsed="1"/>
     <w:lsdException w:name="footnote text" w:semiHidden="1" w:unhideWhenUsed="1"/>
     <w:lsdException w:name="annotation text" w:semiHidden="1" w:unhideWhenUsed="1"/>
     <w:lsdException w:name="header" w:semiHidden="1" w:unhideWhenUsed="1"/>
     <w:lsdException w:name="footer" w:semiHidden="1" w:unhideWhenUsed="1"/>
     <w:lsdException w:name="index heading" w:semiHidden="1" w:unhideWhenUsed="1"/>
-    <w:lsdException w:name="caption" w:uiPriority="35" w:semiHidden="1" w:unhideWhenUsed="1" w:qFormat="1"/>
+    <w:lsdException w:name="caption" w:semiHidden="1" w:uiPriority="35" w:unhideWhenUsed="1" w:qFormat="1"/>
     <w:lsdException w:name="table of figures" w:semiHidden="1" w:unhideWhenUsed="1"/>
     <w:lsdException w:name="envelope address" w:semiHidden="1" w:unhideWhenUsed="1"/>
     <w:lsdException w:name="envelope return" w:semiHidden="1" w:unhideWhenUsed="1"/>
@@ -1715,7 +1696,7 @@
     <w:lsdException w:name="Title" w:uiPriority="10" w:qFormat="1"/>
     <w:lsdException w:name="Closing" w:semiHidden="1" w:unhideWhenUsed="1"/>
     <w:lsdException w:name="Signature" w:semiHidden="1" w:unhideWhenUsed="1"/>
-    <w:lsdException w:name="Default Paragraph Font" w:uiPriority="1" w:semiHidden="1" w:unhideWhenUsed="1"/>
+    <w:lsdException w:name="Default Paragraph Font" w:semiHidden="1" w:uiPriority="1" w:unhideWhenUsed="1"/>
     <w:lsdException w:name="Body Text" w:semiHidden="1" w:unhideWhenUsed="1"/>
     <w:lsdException w:name="Body Text Indent" w:semiHidden="1" w:unhideWhenUsed="1"/>
     <w:lsdException w:name="List Continue" w:semiHidden="1" w:unhideWhenUsed="1"/>
@@ -1915,8 +1896,8 @@
     <w:lsdException w:name="Subtle Reference" w:uiPriority="31" w:qFormat="1"/>
     <w:lsdException w:name="Intense Reference" w:uiPriority="32" w:qFormat="1"/>
     <w:lsdException w:name="Book Title" w:uiPriority="33" w:qFormat="1"/>
-    <w:lsdException w:name="Bibliography" w:uiPriority="37" w:semiHidden="1" w:unhideWhenUsed="1"/>
-    <w:lsdException w:name="TOC Heading" w:uiPriority="39" w:semiHidden="1" w:unhideWhenUsed="1" w:qFormat="1"/>
+    <w:lsdException w:name="Bibliography" w:semiHidden="1" w:uiPriority="37" w:unhideWhenUsed="1"/>
+    <w:lsdException w:name="TOC Heading" w:semiHidden="1" w:uiPriority="39" w:unhideWhenUsed="1" w:qFormat="1"/>
     <w:lsdException w:name="Plain Table 1" w:uiPriority="41"/>
     <w:lsdException w:name="Plain Table 2" w:uiPriority="42"/>
     <w:lsdException w:name="Plain Table 3" w:uiPriority="43"/>
@@ -2027,26 +2008,15 @@
     <w:lsdException w:name="Unresolved Mention" w:semiHidden="1" w:unhideWhenUsed="1"/>
     <w:lsdException w:name="Smart Link" w:semiHidden="1" w:unhideWhenUsed="1"/>
   </w:latentStyles>
-  <w:style w:type="paragraph" w:styleId="Normal" w:default="1">
+  <w:style w:type="paragraph" w:default="1" w:styleId="Normal">
     <w:name w:val="Normal"/>
     <w:qFormat/>
     <w:pPr>
-      <w:widowControl/>
-      <w:bidi w:val="0"/>
-      <w:spacing w:lineRule="auto" w:line="259" w:before="0" w:after="160"/>
-      <w:jc w:val="left"/>
+      <w:spacing w:after="160" w:line="259" w:lineRule="auto"/>
     </w:pPr>
-    <w:rPr>
-      <w:rFonts w:ascii="Aptos" w:hAnsi="Aptos" w:eastAsia="Aptos" w:cs="Arial" w:asciiTheme="minorHAnsi" w:cstheme="minorBidi" w:eastAsiaTheme="minorHAnsi" w:hAnsiTheme="minorHAnsi"/>
-      <w:color w:val="auto"/>
-      <w:kern w:val="0"/>
-      <w:sz w:val="22"/>
-      <w:szCs w:val="22"/>
-      <w:lang w:val="en-CA" w:eastAsia="en-US" w:bidi="ar-SA"/>
-    </w:rPr>
   </w:style>
   <w:style w:type="paragraph" w:styleId="Heading1">
-    <w:name w:val="Heading 1"/>
+    <w:name w:val="heading 1"/>
     <w:basedOn w:val="Normal"/>
     <w:next w:val="Normal"/>
     <w:link w:val="Heading1Char"/>
@@ -2054,20 +2024,20 @@
     <w:qFormat/>
     <w:rsid w:val="00837274"/>
     <w:pPr>
-      <w:keepNext w:val="true"/>
+      <w:keepNext/>
       <w:keepLines/>
       <w:spacing w:before="360" w:after="80"/>
       <w:outlineLvl w:val="0"/>
     </w:pPr>
     <w:rPr>
-      <w:rFonts w:ascii="Aptos Display" w:hAnsi="Aptos Display" w:eastAsia="" w:cs="Times New Roman" w:asciiTheme="majorHAnsi" w:cstheme="majorBidi" w:eastAsiaTheme="majorEastAsia" w:hAnsiTheme="majorHAnsi"/>
-      <w:color w:themeColor="accent1" w:themeShade="bf" w:val="0F4761"/>
+      <w:rFonts w:asciiTheme="majorHAnsi" w:eastAsiaTheme="majorEastAsia" w:hAnsiTheme="majorHAnsi" w:cstheme="majorBidi"/>
+      <w:color w:val="0F4761" w:themeColor="accent1" w:themeShade="BF"/>
       <w:sz w:val="40"/>
       <w:szCs w:val="40"/>
     </w:rPr>
   </w:style>
   <w:style w:type="paragraph" w:styleId="Heading2">
-    <w:name w:val="Heading 2"/>
+    <w:name w:val="heading 2"/>
     <w:basedOn w:val="Normal"/>
     <w:next w:val="Normal"/>
     <w:link w:val="Heading2Char"/>
@@ -2077,20 +2047,20 @@
     <w:qFormat/>
     <w:rsid w:val="00837274"/>
     <w:pPr>
-      <w:keepNext w:val="true"/>
+      <w:keepNext/>
       <w:keepLines/>
       <w:spacing w:before="160" w:after="80"/>
       <w:outlineLvl w:val="1"/>
     </w:pPr>
     <w:rPr>
-      <w:rFonts w:ascii="Aptos Display" w:hAnsi="Aptos Display" w:eastAsia="" w:cs="Times New Roman" w:asciiTheme="majorHAnsi" w:cstheme="majorBidi" w:eastAsiaTheme="majorEastAsia" w:hAnsiTheme="majorHAnsi"/>
-      <w:color w:themeColor="accent1" w:themeShade="bf" w:val="0F4761"/>
+      <w:rFonts w:asciiTheme="majorHAnsi" w:eastAsiaTheme="majorEastAsia" w:hAnsiTheme="majorHAnsi" w:cstheme="majorBidi"/>
+      <w:color w:val="0F4761" w:themeColor="accent1" w:themeShade="BF"/>
       <w:sz w:val="32"/>
       <w:szCs w:val="32"/>
     </w:rPr>
   </w:style>
   <w:style w:type="paragraph" w:styleId="Heading3">
-    <w:name w:val="Heading 3"/>
+    <w:name w:val="heading 3"/>
     <w:basedOn w:val="Normal"/>
     <w:next w:val="Normal"/>
     <w:link w:val="Heading3Char"/>
@@ -2100,20 +2070,20 @@
     <w:qFormat/>
     <w:rsid w:val="00837274"/>
     <w:pPr>
-      <w:keepNext w:val="true"/>
+      <w:keepNext/>
       <w:keepLines/>
       <w:spacing w:before="160" w:after="80"/>
       <w:outlineLvl w:val="2"/>
     </w:pPr>
     <w:rPr>
-      <w:rFonts w:eastAsia="" w:cs="Times New Roman" w:cstheme="majorBidi" w:eastAsiaTheme="majorEastAsia"/>
-      <w:color w:themeColor="accent1" w:themeShade="bf" w:val="0F4761"/>
+      <w:rFonts w:eastAsiaTheme="majorEastAsia" w:cstheme="majorBidi"/>
+      <w:color w:val="0F4761" w:themeColor="accent1" w:themeShade="BF"/>
       <w:sz w:val="28"/>
       <w:szCs w:val="28"/>
     </w:rPr>
   </w:style>
   <w:style w:type="paragraph" w:styleId="Heading4">
-    <w:name w:val="Heading 4"/>
+    <w:name w:val="heading 4"/>
     <w:basedOn w:val="Normal"/>
     <w:next w:val="Normal"/>
     <w:link w:val="Heading4Char"/>
@@ -2123,20 +2093,20 @@
     <w:qFormat/>
     <w:rsid w:val="00837274"/>
     <w:pPr>
-      <w:keepNext w:val="true"/>
+      <w:keepNext/>
       <w:keepLines/>
       <w:spacing w:before="80" w:after="40"/>
       <w:outlineLvl w:val="3"/>
     </w:pPr>
     <w:rPr>
-      <w:rFonts w:eastAsia="" w:cs="Times New Roman" w:cstheme="majorBidi" w:eastAsiaTheme="majorEastAsia"/>
+      <w:rFonts w:eastAsiaTheme="majorEastAsia" w:cstheme="majorBidi"/>
       <w:i/>
       <w:iCs/>
-      <w:color w:themeColor="accent1" w:themeShade="bf" w:val="0F4761"/>
+      <w:color w:val="0F4761" w:themeColor="accent1" w:themeShade="BF"/>
     </w:rPr>
   </w:style>
   <w:style w:type="paragraph" w:styleId="Heading5">
-    <w:name w:val="Heading 5"/>
+    <w:name w:val="heading 5"/>
     <w:basedOn w:val="Normal"/>
     <w:next w:val="Normal"/>
     <w:link w:val="Heading5Char"/>
@@ -2146,18 +2116,18 @@
     <w:qFormat/>
     <w:rsid w:val="00837274"/>
     <w:pPr>
-      <w:keepNext w:val="true"/>
+      <w:keepNext/>
       <w:keepLines/>
       <w:spacing w:before="80" w:after="40"/>
       <w:outlineLvl w:val="4"/>
     </w:pPr>
     <w:rPr>
-      <w:rFonts w:eastAsia="" w:cs="Times New Roman" w:cstheme="majorBidi" w:eastAsiaTheme="majorEastAsia"/>
-      <w:color w:themeColor="accent1" w:themeShade="bf" w:val="0F4761"/>
+      <w:rFonts w:eastAsiaTheme="majorEastAsia" w:cstheme="majorBidi"/>
+      <w:color w:val="0F4761" w:themeColor="accent1" w:themeShade="BF"/>
     </w:rPr>
   </w:style>
   <w:style w:type="paragraph" w:styleId="Heading6">
-    <w:name w:val="Heading 6"/>
+    <w:name w:val="heading 6"/>
     <w:basedOn w:val="Normal"/>
     <w:next w:val="Normal"/>
     <w:link w:val="Heading6Char"/>
@@ -2167,20 +2137,20 @@
     <w:qFormat/>
     <w:rsid w:val="00837274"/>
     <w:pPr>
-      <w:keepNext w:val="true"/>
+      <w:keepNext/>
       <w:keepLines/>
       <w:spacing w:before="40" w:after="0"/>
       <w:outlineLvl w:val="5"/>
     </w:pPr>
     <w:rPr>
-      <w:rFonts w:eastAsia="" w:cs="Times New Roman" w:cstheme="majorBidi" w:eastAsiaTheme="majorEastAsia"/>
+      <w:rFonts w:eastAsiaTheme="majorEastAsia" w:cstheme="majorBidi"/>
       <w:i/>
       <w:iCs/>
-      <w:color w:themeColor="text1" w:themeTint="a6" w:val="595959"/>
+      <w:color w:val="595959" w:themeColor="text1" w:themeTint="A6"/>
     </w:rPr>
   </w:style>
   <w:style w:type="paragraph" w:styleId="Heading7">
-    <w:name w:val="Heading 7"/>
+    <w:name w:val="heading 7"/>
     <w:basedOn w:val="Normal"/>
     <w:next w:val="Normal"/>
     <w:link w:val="Heading7Char"/>
@@ -2190,18 +2160,18 @@
     <w:qFormat/>
     <w:rsid w:val="00837274"/>
     <w:pPr>
-      <w:keepNext w:val="true"/>
+      <w:keepNext/>
       <w:keepLines/>
       <w:spacing w:before="40" w:after="0"/>
       <w:outlineLvl w:val="6"/>
     </w:pPr>
     <w:rPr>
-      <w:rFonts w:eastAsia="" w:cs="Times New Roman" w:cstheme="majorBidi" w:eastAsiaTheme="majorEastAsia"/>
-      <w:color w:themeColor="text1" w:themeTint="a6" w:val="595959"/>
+      <w:rFonts w:eastAsiaTheme="majorEastAsia" w:cstheme="majorBidi"/>
+      <w:color w:val="595959" w:themeColor="text1" w:themeTint="A6"/>
     </w:rPr>
   </w:style>
   <w:style w:type="paragraph" w:styleId="Heading8">
-    <w:name w:val="Heading 8"/>
+    <w:name w:val="heading 8"/>
     <w:basedOn w:val="Normal"/>
     <w:next w:val="Normal"/>
     <w:link w:val="Heading8Char"/>
@@ -2211,20 +2181,20 @@
     <w:qFormat/>
     <w:rsid w:val="00837274"/>
     <w:pPr>
-      <w:keepNext w:val="true"/>
+      <w:keepNext/>
       <w:keepLines/>
-      <w:spacing w:before="0" w:after="0"/>
+      <w:spacing w:after="0"/>
       <w:outlineLvl w:val="7"/>
     </w:pPr>
     <w:rPr>
-      <w:rFonts w:eastAsia="" w:cs="Times New Roman" w:cstheme="majorBidi" w:eastAsiaTheme="majorEastAsia"/>
+      <w:rFonts w:eastAsiaTheme="majorEastAsia" w:cstheme="majorBidi"/>
       <w:i/>
       <w:iCs/>
-      <w:color w:themeColor="text1" w:themeTint="d8" w:val="272727"/>
+      <w:color w:val="272727" w:themeColor="text1" w:themeTint="D8"/>
     </w:rPr>
   </w:style>
   <w:style w:type="paragraph" w:styleId="Heading9">
-    <w:name w:val="Heading 9"/>
+    <w:name w:val="heading 9"/>
     <w:basedOn w:val="Normal"/>
     <w:next w:val="Normal"/>
     <w:link w:val="Heading9Char"/>
@@ -2234,389 +2204,21 @@
     <w:qFormat/>
     <w:rsid w:val="00837274"/>
     <w:pPr>
-      <w:keepNext w:val="true"/>
+      <w:keepNext/>
       <w:keepLines/>
-      <w:spacing w:before="0" w:after="0"/>
+      <w:spacing w:after="0"/>
       <w:outlineLvl w:val="8"/>
     </w:pPr>
     <w:rPr>
-      <w:rFonts w:eastAsia="" w:cs="Times New Roman" w:cstheme="majorBidi" w:eastAsiaTheme="majorEastAsia"/>
-      <w:color w:themeColor="text1" w:themeTint="d8" w:val="272727"/>
-    </w:rPr>
-  </w:style>
-  <w:style w:type="character" w:styleId="DefaultParagraphFont" w:default="1">
+      <w:rFonts w:eastAsiaTheme="majorEastAsia" w:cstheme="majorBidi"/>
+      <w:color w:val="272727" w:themeColor="text1" w:themeTint="D8"/>
+    </w:rPr>
+  </w:style>
+  <w:style w:type="character" w:default="1" w:styleId="DefaultParagraphFont">
     <w:name w:val="Default Paragraph Font"/>
     <w:uiPriority w:val="1"/>
     <w:semiHidden/>
     <w:unhideWhenUsed/>
-    <w:qFormat/>
-    <w:rPr/>
-  </w:style>
-  <w:style w:type="character" w:styleId="Heading1Char" w:customStyle="1">
-    <w:name w:val="Heading 1 Char"/>
-    <w:basedOn w:val="DefaultParagraphFont"/>
-    <w:link w:val="Heading1"/>
-    <w:uiPriority w:val="9"/>
-    <w:qFormat/>
-    <w:rsid w:val="00837274"/>
-    <w:rPr>
-      <w:rFonts w:ascii="Aptos Display" w:hAnsi="Aptos Display" w:eastAsia="" w:cs="Times New Roman" w:asciiTheme="majorHAnsi" w:cstheme="majorBidi" w:eastAsiaTheme="majorEastAsia" w:hAnsiTheme="majorHAnsi"/>
-      <w:color w:themeColor="accent1" w:themeShade="bf" w:val="0F4761"/>
-      <w:sz w:val="40"/>
-      <w:szCs w:val="40"/>
-    </w:rPr>
-  </w:style>
-  <w:style w:type="character" w:styleId="Heading2Char" w:customStyle="1">
-    <w:name w:val="Heading 2 Char"/>
-    <w:basedOn w:val="DefaultParagraphFont"/>
-    <w:link w:val="Heading2"/>
-    <w:uiPriority w:val="9"/>
-    <w:semiHidden/>
-    <w:qFormat/>
-    <w:rsid w:val="00837274"/>
-    <w:rPr>
-      <w:rFonts w:ascii="Aptos Display" w:hAnsi="Aptos Display" w:eastAsia="" w:cs="Times New Roman" w:asciiTheme="majorHAnsi" w:cstheme="majorBidi" w:eastAsiaTheme="majorEastAsia" w:hAnsiTheme="majorHAnsi"/>
-      <w:color w:themeColor="accent1" w:themeShade="bf" w:val="0F4761"/>
-      <w:sz w:val="32"/>
-      <w:szCs w:val="32"/>
-    </w:rPr>
-  </w:style>
-  <w:style w:type="character" w:styleId="Heading3Char" w:customStyle="1">
-    <w:name w:val="Heading 3 Char"/>
-    <w:basedOn w:val="DefaultParagraphFont"/>
-    <w:link w:val="Heading3"/>
-    <w:uiPriority w:val="9"/>
-    <w:semiHidden/>
-    <w:qFormat/>
-    <w:rsid w:val="00837274"/>
-    <w:rPr>
-      <w:rFonts w:eastAsia="" w:cs="Times New Roman" w:cstheme="majorBidi" w:eastAsiaTheme="majorEastAsia"/>
-      <w:color w:themeColor="accent1" w:themeShade="bf" w:val="0F4761"/>
-      <w:sz w:val="28"/>
-      <w:szCs w:val="28"/>
-    </w:rPr>
-  </w:style>
-  <w:style w:type="character" w:styleId="Heading4Char" w:customStyle="1">
-    <w:name w:val="Heading 4 Char"/>
-    <w:basedOn w:val="DefaultParagraphFont"/>
-    <w:link w:val="Heading4"/>
-    <w:uiPriority w:val="9"/>
-    <w:semiHidden/>
-    <w:qFormat/>
-    <w:rsid w:val="00837274"/>
-    <w:rPr>
-      <w:rFonts w:eastAsia="" w:cs="Times New Roman" w:cstheme="majorBidi" w:eastAsiaTheme="majorEastAsia"/>
-      <w:i/>
-      <w:iCs/>
-      <w:color w:themeColor="accent1" w:themeShade="bf" w:val="0F4761"/>
-    </w:rPr>
-  </w:style>
-  <w:style w:type="character" w:styleId="Heading5Char" w:customStyle="1">
-    <w:name w:val="Heading 5 Char"/>
-    <w:basedOn w:val="DefaultParagraphFont"/>
-    <w:link w:val="Heading5"/>
-    <w:uiPriority w:val="9"/>
-    <w:semiHidden/>
-    <w:qFormat/>
-    <w:rsid w:val="00837274"/>
-    <w:rPr>
-      <w:rFonts w:eastAsia="" w:cs="Times New Roman" w:cstheme="majorBidi" w:eastAsiaTheme="majorEastAsia"/>
-      <w:color w:themeColor="accent1" w:themeShade="bf" w:val="0F4761"/>
-    </w:rPr>
-  </w:style>
-  <w:style w:type="character" w:styleId="Heading6Char" w:customStyle="1">
-    <w:name w:val="Heading 6 Char"/>
-    <w:basedOn w:val="DefaultParagraphFont"/>
-    <w:link w:val="Heading6"/>
-    <w:uiPriority w:val="9"/>
-    <w:semiHidden/>
-    <w:qFormat/>
-    <w:rsid w:val="00837274"/>
-    <w:rPr>
-      <w:rFonts w:eastAsia="" w:cs="Times New Roman" w:cstheme="majorBidi" w:eastAsiaTheme="majorEastAsia"/>
-      <w:i/>
-      <w:iCs/>
-      <w:color w:themeColor="text1" w:themeTint="a6" w:val="595959"/>
-    </w:rPr>
-  </w:style>
-  <w:style w:type="character" w:styleId="Heading7Char" w:customStyle="1">
-    <w:name w:val="Heading 7 Char"/>
-    <w:basedOn w:val="DefaultParagraphFont"/>
-    <w:link w:val="Heading7"/>
-    <w:uiPriority w:val="9"/>
-    <w:semiHidden/>
-    <w:qFormat/>
-    <w:rsid w:val="00837274"/>
-    <w:rPr>
-      <w:rFonts w:eastAsia="" w:cs="Times New Roman" w:cstheme="majorBidi" w:eastAsiaTheme="majorEastAsia"/>
-      <w:color w:themeColor="text1" w:themeTint="a6" w:val="595959"/>
-    </w:rPr>
-  </w:style>
-  <w:style w:type="character" w:styleId="Heading8Char" w:customStyle="1">
-    <w:name w:val="Heading 8 Char"/>
-    <w:basedOn w:val="DefaultParagraphFont"/>
-    <w:link w:val="Heading8"/>
-    <w:uiPriority w:val="9"/>
-    <w:semiHidden/>
-    <w:qFormat/>
-    <w:rsid w:val="00837274"/>
-    <w:rPr>
-      <w:rFonts w:eastAsia="" w:cs="Times New Roman" w:cstheme="majorBidi" w:eastAsiaTheme="majorEastAsia"/>
-      <w:i/>
-      <w:iCs/>
-      <w:color w:themeColor="text1" w:themeTint="d8" w:val="272727"/>
-    </w:rPr>
-  </w:style>
-  <w:style w:type="character" w:styleId="Heading9Char" w:customStyle="1">
-    <w:name w:val="Heading 9 Char"/>
-    <w:basedOn w:val="DefaultParagraphFont"/>
-    <w:link w:val="Heading9"/>
-    <w:uiPriority w:val="9"/>
-    <w:semiHidden/>
-    <w:qFormat/>
-    <w:rsid w:val="00837274"/>
-    <w:rPr>
-      <w:rFonts w:eastAsia="" w:cs="Times New Roman" w:cstheme="majorBidi" w:eastAsiaTheme="majorEastAsia"/>
-      <w:color w:themeColor="text1" w:themeTint="d8" w:val="272727"/>
-    </w:rPr>
-  </w:style>
-  <w:style w:type="character" w:styleId="TitleChar" w:customStyle="1">
-    <w:name w:val="Title Char"/>
-    <w:basedOn w:val="DefaultParagraphFont"/>
-    <w:link w:val="Title"/>
-    <w:uiPriority w:val="10"/>
-    <w:qFormat/>
-    <w:rsid w:val="00837274"/>
-    <w:rPr>
-      <w:rFonts w:ascii="Aptos Display" w:hAnsi="Aptos Display" w:eastAsia="" w:cs="Times New Roman" w:asciiTheme="majorHAnsi" w:cstheme="majorBidi" w:eastAsiaTheme="majorEastAsia" w:hAnsiTheme="majorHAnsi"/>
-      <w:spacing w:val="-10"/>
-      <w:kern w:val="2"/>
-      <w:sz w:val="56"/>
-      <w:szCs w:val="56"/>
-    </w:rPr>
-  </w:style>
-  <w:style w:type="character" w:styleId="SubtitleChar" w:customStyle="1">
-    <w:name w:val="Subtitle Char"/>
-    <w:basedOn w:val="DefaultParagraphFont"/>
-    <w:link w:val="Subtitle"/>
-    <w:uiPriority w:val="11"/>
-    <w:qFormat/>
-    <w:rsid w:val="00837274"/>
-    <w:rPr>
-      <w:rFonts w:eastAsia="" w:cs="Times New Roman" w:cstheme="majorBidi" w:eastAsiaTheme="majorEastAsia"/>
-      <w:color w:themeColor="text1" w:themeTint="a6" w:val="595959"/>
-      <w:spacing w:val="15"/>
-      <w:sz w:val="28"/>
-      <w:szCs w:val="28"/>
-    </w:rPr>
-  </w:style>
-  <w:style w:type="character" w:styleId="QuoteChar" w:customStyle="1">
-    <w:name w:val="Quote Char"/>
-    <w:basedOn w:val="DefaultParagraphFont"/>
-    <w:link w:val="Quote"/>
-    <w:uiPriority w:val="29"/>
-    <w:qFormat/>
-    <w:rsid w:val="00837274"/>
-    <w:rPr>
-      <w:i/>
-      <w:iCs/>
-      <w:color w:themeColor="text1" w:themeTint="bf" w:val="404040"/>
-    </w:rPr>
-  </w:style>
-  <w:style w:type="character" w:styleId="IntenseEmphasis">
-    <w:name w:val="Intense Emphasis"/>
-    <w:basedOn w:val="DefaultParagraphFont"/>
-    <w:uiPriority w:val="21"/>
-    <w:qFormat/>
-    <w:rsid w:val="00837274"/>
-    <w:rPr>
-      <w:i/>
-      <w:iCs/>
-      <w:color w:themeColor="accent1" w:themeShade="bf" w:val="0F4761"/>
-    </w:rPr>
-  </w:style>
-  <w:style w:type="character" w:styleId="IntenseQuoteChar" w:customStyle="1">
-    <w:name w:val="Intense Quote Char"/>
-    <w:basedOn w:val="DefaultParagraphFont"/>
-    <w:link w:val="IntenseQuote"/>
-    <w:uiPriority w:val="30"/>
-    <w:qFormat/>
-    <w:rsid w:val="00837274"/>
-    <w:rPr>
-      <w:i/>
-      <w:iCs/>
-      <w:color w:themeColor="accent1" w:themeShade="bf" w:val="0F4761"/>
-    </w:rPr>
-  </w:style>
-  <w:style w:type="character" w:styleId="IntenseReference">
-    <w:name w:val="Intense Reference"/>
-    <w:basedOn w:val="DefaultParagraphFont"/>
-    <w:uiPriority w:val="32"/>
-    <w:qFormat/>
-    <w:rsid w:val="00837274"/>
-    <w:rPr>
-      <w:b/>
-      <w:bCs/>
-      <w:smallCaps/>
-      <w:color w:themeColor="accent1" w:themeShade="bf" w:val="0F4761"/>
-      <w:spacing w:val="5"/>
-    </w:rPr>
-  </w:style>
-  <w:style w:type="paragraph" w:styleId="Heading">
-    <w:name w:val="Heading"/>
-    <w:basedOn w:val="Normal"/>
-    <w:next w:val="BodyText"/>
-    <w:qFormat/>
-    <w:pPr>
-      <w:keepNext w:val="true"/>
-      <w:spacing w:before="240" w:after="120"/>
-    </w:pPr>
-    <w:rPr>
-      <w:rFonts w:ascii="Liberation Sans" w:hAnsi="Liberation Sans" w:eastAsia="Source Han Sans CN" w:cs="FreeSans"/>
-      <w:sz w:val="28"/>
-      <w:szCs w:val="28"/>
-    </w:rPr>
-  </w:style>
-  <w:style w:type="paragraph" w:styleId="BodyText">
-    <w:name w:val="Body Text"/>
-    <w:basedOn w:val="Normal"/>
-    <w:pPr>
-      <w:spacing w:lineRule="auto" w:line="276" w:before="0" w:after="140"/>
-    </w:pPr>
-    <w:rPr/>
-  </w:style>
-  <w:style w:type="paragraph" w:styleId="List">
-    <w:name w:val="List"/>
-    <w:basedOn w:val="BodyText"/>
-    <w:pPr/>
-    <w:rPr>
-      <w:rFonts w:cs="FreeSans"/>
-    </w:rPr>
-  </w:style>
-  <w:style w:type="paragraph" w:styleId="Caption">
-    <w:name w:val="Caption"/>
-    <w:basedOn w:val="Normal"/>
-    <w:qFormat/>
-    <w:pPr>
-      <w:suppressLineNumbers/>
-      <w:spacing w:before="120" w:after="120"/>
-    </w:pPr>
-    <w:rPr>
-      <w:rFonts w:cs="FreeSans"/>
-      <w:i/>
-      <w:iCs/>
-      <w:sz w:val="24"/>
-      <w:szCs w:val="24"/>
-    </w:rPr>
-  </w:style>
-  <w:style w:type="paragraph" w:styleId="Index">
-    <w:name w:val="Index"/>
-    <w:basedOn w:val="Normal"/>
-    <w:qFormat/>
-    <w:pPr>
-      <w:suppressLineNumbers/>
-    </w:pPr>
-    <w:rPr>
-      <w:rFonts w:cs="FreeSans"/>
-    </w:rPr>
-  </w:style>
-  <w:style w:type="paragraph" w:styleId="Title">
-    <w:name w:val="Title"/>
-    <w:basedOn w:val="Normal"/>
-    <w:next w:val="Normal"/>
-    <w:link w:val="TitleChar"/>
-    <w:uiPriority w:val="10"/>
-    <w:qFormat/>
-    <w:rsid w:val="00837274"/>
-    <w:pPr>
-      <w:spacing w:lineRule="auto" w:line="240" w:before="0" w:after="80"/>
-      <w:contextualSpacing/>
-    </w:pPr>
-    <w:rPr>
-      <w:rFonts w:ascii="Aptos Display" w:hAnsi="Aptos Display" w:eastAsia="" w:cs="Times New Roman" w:asciiTheme="majorHAnsi" w:cstheme="majorBidi" w:eastAsiaTheme="majorEastAsia" w:hAnsiTheme="majorHAnsi"/>
-      <w:spacing w:val="-10"/>
-      <w:kern w:val="2"/>
-      <w:sz w:val="56"/>
-      <w:szCs w:val="56"/>
-    </w:rPr>
-  </w:style>
-  <w:style w:type="paragraph" w:styleId="Subtitle">
-    <w:name w:val="Subtitle"/>
-    <w:basedOn w:val="Normal"/>
-    <w:next w:val="Normal"/>
-    <w:link w:val="SubtitleChar"/>
-    <w:uiPriority w:val="11"/>
-    <w:qFormat/>
-    <w:rsid w:val="00837274"/>
-    <w:pPr/>
-    <w:rPr>
-      <w:rFonts w:eastAsia="" w:cs="Times New Roman" w:cstheme="majorBidi" w:eastAsiaTheme="majorEastAsia"/>
-      <w:color w:themeColor="text1" w:themeTint="a6" w:val="595959"/>
-      <w:spacing w:val="15"/>
-      <w:sz w:val="28"/>
-      <w:szCs w:val="28"/>
-    </w:rPr>
-  </w:style>
-  <w:style w:type="paragraph" w:styleId="Quote">
-    <w:name w:val="Quote"/>
-    <w:basedOn w:val="Normal"/>
-    <w:next w:val="Normal"/>
-    <w:link w:val="QuoteChar"/>
-    <w:uiPriority w:val="29"/>
-    <w:qFormat/>
-    <w:rsid w:val="00837274"/>
-    <w:pPr>
-      <w:spacing w:before="160" w:after="160"/>
-      <w:jc w:val="center"/>
-    </w:pPr>
-    <w:rPr>
-      <w:i/>
-      <w:iCs/>
-      <w:color w:themeColor="text1" w:themeTint="bf" w:val="404040"/>
-    </w:rPr>
-  </w:style>
-  <w:style w:type="paragraph" w:styleId="ListParagraph">
-    <w:name w:val="List Paragraph"/>
-    <w:basedOn w:val="Normal"/>
-    <w:uiPriority w:val="34"/>
-    <w:qFormat/>
-    <w:rsid w:val="00837274"/>
-    <w:pPr>
-      <w:spacing w:before="0" w:after="160"/>
-      <w:ind w:left="720"/>
-      <w:contextualSpacing/>
-    </w:pPr>
-    <w:rPr/>
-  </w:style>
-  <w:style w:type="paragraph" w:styleId="IntenseQuote">
-    <w:name w:val="Intense Quote"/>
-    <w:basedOn w:val="Normal"/>
-    <w:next w:val="Normal"/>
-    <w:link w:val="IntenseQuoteChar"/>
-    <w:uiPriority w:val="30"/>
-    <w:qFormat/>
-    <w:rsid w:val="00837274"/>
-    <w:pPr>
-      <w:pBdr>
-        <w:top w:val="single" w:sz="4" w:space="10" w:color="0F4761" w:themeColor="accent1" w:themeShade="bf"/>
-        <w:bottom w:val="single" w:sz="4" w:space="10" w:color="0F4761" w:themeColor="accent1" w:themeShade="bf"/>
-      </w:pBdr>
-      <w:spacing w:before="360" w:after="360"/>
-      <w:ind w:left="864" w:right="864"/>
-      <w:jc w:val="center"/>
-    </w:pPr>
-    <w:rPr>
-      <w:i/>
-      <w:iCs/>
-      <w:color w:themeColor="accent1" w:themeShade="bf" w:val="0F4761"/>
-    </w:rPr>
-  </w:style>
-  <w:style w:type="numbering" w:styleId="NoList" w:default="1">
-    <w:name w:val="No List"/>
-    <w:uiPriority w:val="99"/>
-    <w:semiHidden/>
-    <w:unhideWhenUsed/>
-    <w:qFormat/>
   </w:style>
   <w:style w:type="table" w:default="1" w:styleId="TableNormal">
     <w:name w:val="Normal Table"/>
@@ -2624,6 +2226,7 @@
     <w:semiHidden/>
     <w:unhideWhenUsed/>
     <w:tblPr>
+      <w:tblInd w:w="0" w:type="dxa"/>
       <w:tblCellMar>
         <w:top w:w="0" w:type="dxa"/>
         <w:left w:w="108" w:type="dxa"/>
@@ -2632,58 +2235,418 @@
       </w:tblCellMar>
     </w:tblPr>
   </w:style>
+  <w:style w:type="numbering" w:default="1" w:styleId="NoList">
+    <w:name w:val="No List"/>
+    <w:uiPriority w:val="99"/>
+    <w:semiHidden/>
+    <w:unhideWhenUsed/>
+  </w:style>
+  <w:style w:type="character" w:customStyle="1" w:styleId="Heading1Char">
+    <w:name w:val="Heading 1 Char"/>
+    <w:basedOn w:val="DefaultParagraphFont"/>
+    <w:link w:val="Heading1"/>
+    <w:uiPriority w:val="9"/>
+    <w:qFormat/>
+    <w:rsid w:val="00837274"/>
+    <w:rPr>
+      <w:rFonts w:asciiTheme="majorHAnsi" w:eastAsiaTheme="majorEastAsia" w:hAnsiTheme="majorHAnsi" w:cstheme="majorBidi"/>
+      <w:color w:val="0F4761" w:themeColor="accent1" w:themeShade="BF"/>
+      <w:sz w:val="40"/>
+      <w:szCs w:val="40"/>
+    </w:rPr>
+  </w:style>
+  <w:style w:type="character" w:customStyle="1" w:styleId="Heading2Char">
+    <w:name w:val="Heading 2 Char"/>
+    <w:basedOn w:val="DefaultParagraphFont"/>
+    <w:link w:val="Heading2"/>
+    <w:uiPriority w:val="9"/>
+    <w:semiHidden/>
+    <w:qFormat/>
+    <w:rsid w:val="00837274"/>
+    <w:rPr>
+      <w:rFonts w:asciiTheme="majorHAnsi" w:eastAsiaTheme="majorEastAsia" w:hAnsiTheme="majorHAnsi" w:cstheme="majorBidi"/>
+      <w:color w:val="0F4761" w:themeColor="accent1" w:themeShade="BF"/>
+      <w:sz w:val="32"/>
+      <w:szCs w:val="32"/>
+    </w:rPr>
+  </w:style>
+  <w:style w:type="character" w:customStyle="1" w:styleId="Heading3Char">
+    <w:name w:val="Heading 3 Char"/>
+    <w:basedOn w:val="DefaultParagraphFont"/>
+    <w:link w:val="Heading3"/>
+    <w:uiPriority w:val="9"/>
+    <w:semiHidden/>
+    <w:qFormat/>
+    <w:rsid w:val="00837274"/>
+    <w:rPr>
+      <w:rFonts w:eastAsiaTheme="majorEastAsia" w:cstheme="majorBidi"/>
+      <w:color w:val="0F4761" w:themeColor="accent1" w:themeShade="BF"/>
+      <w:sz w:val="28"/>
+      <w:szCs w:val="28"/>
+    </w:rPr>
+  </w:style>
+  <w:style w:type="character" w:customStyle="1" w:styleId="Heading4Char">
+    <w:name w:val="Heading 4 Char"/>
+    <w:basedOn w:val="DefaultParagraphFont"/>
+    <w:link w:val="Heading4"/>
+    <w:uiPriority w:val="9"/>
+    <w:semiHidden/>
+    <w:qFormat/>
+    <w:rsid w:val="00837274"/>
+    <w:rPr>
+      <w:rFonts w:eastAsiaTheme="majorEastAsia" w:cstheme="majorBidi"/>
+      <w:i/>
+      <w:iCs/>
+      <w:color w:val="0F4761" w:themeColor="accent1" w:themeShade="BF"/>
+    </w:rPr>
+  </w:style>
+  <w:style w:type="character" w:customStyle="1" w:styleId="Heading5Char">
+    <w:name w:val="Heading 5 Char"/>
+    <w:basedOn w:val="DefaultParagraphFont"/>
+    <w:link w:val="Heading5"/>
+    <w:uiPriority w:val="9"/>
+    <w:semiHidden/>
+    <w:qFormat/>
+    <w:rsid w:val="00837274"/>
+    <w:rPr>
+      <w:rFonts w:eastAsiaTheme="majorEastAsia" w:cstheme="majorBidi"/>
+      <w:color w:val="0F4761" w:themeColor="accent1" w:themeShade="BF"/>
+    </w:rPr>
+  </w:style>
+  <w:style w:type="character" w:customStyle="1" w:styleId="Heading6Char">
+    <w:name w:val="Heading 6 Char"/>
+    <w:basedOn w:val="DefaultParagraphFont"/>
+    <w:link w:val="Heading6"/>
+    <w:uiPriority w:val="9"/>
+    <w:semiHidden/>
+    <w:qFormat/>
+    <w:rsid w:val="00837274"/>
+    <w:rPr>
+      <w:rFonts w:eastAsiaTheme="majorEastAsia" w:cstheme="majorBidi"/>
+      <w:i/>
+      <w:iCs/>
+      <w:color w:val="595959" w:themeColor="text1" w:themeTint="A6"/>
+    </w:rPr>
+  </w:style>
+  <w:style w:type="character" w:customStyle="1" w:styleId="Heading7Char">
+    <w:name w:val="Heading 7 Char"/>
+    <w:basedOn w:val="DefaultParagraphFont"/>
+    <w:link w:val="Heading7"/>
+    <w:uiPriority w:val="9"/>
+    <w:semiHidden/>
+    <w:qFormat/>
+    <w:rsid w:val="00837274"/>
+    <w:rPr>
+      <w:rFonts w:eastAsiaTheme="majorEastAsia" w:cstheme="majorBidi"/>
+      <w:color w:val="595959" w:themeColor="text1" w:themeTint="A6"/>
+    </w:rPr>
+  </w:style>
+  <w:style w:type="character" w:customStyle="1" w:styleId="Heading8Char">
+    <w:name w:val="Heading 8 Char"/>
+    <w:basedOn w:val="DefaultParagraphFont"/>
+    <w:link w:val="Heading8"/>
+    <w:uiPriority w:val="9"/>
+    <w:semiHidden/>
+    <w:qFormat/>
+    <w:rsid w:val="00837274"/>
+    <w:rPr>
+      <w:rFonts w:eastAsiaTheme="majorEastAsia" w:cstheme="majorBidi"/>
+      <w:i/>
+      <w:iCs/>
+      <w:color w:val="272727" w:themeColor="text1" w:themeTint="D8"/>
+    </w:rPr>
+  </w:style>
+  <w:style w:type="character" w:customStyle="1" w:styleId="Heading9Char">
+    <w:name w:val="Heading 9 Char"/>
+    <w:basedOn w:val="DefaultParagraphFont"/>
+    <w:link w:val="Heading9"/>
+    <w:uiPriority w:val="9"/>
+    <w:semiHidden/>
+    <w:qFormat/>
+    <w:rsid w:val="00837274"/>
+    <w:rPr>
+      <w:rFonts w:eastAsiaTheme="majorEastAsia" w:cstheme="majorBidi"/>
+      <w:color w:val="272727" w:themeColor="text1" w:themeTint="D8"/>
+    </w:rPr>
+  </w:style>
+  <w:style w:type="character" w:customStyle="1" w:styleId="TitleChar">
+    <w:name w:val="Title Char"/>
+    <w:basedOn w:val="DefaultParagraphFont"/>
+    <w:link w:val="Title"/>
+    <w:uiPriority w:val="10"/>
+    <w:qFormat/>
+    <w:rsid w:val="00837274"/>
+    <w:rPr>
+      <w:rFonts w:asciiTheme="majorHAnsi" w:eastAsiaTheme="majorEastAsia" w:hAnsiTheme="majorHAnsi" w:cstheme="majorBidi"/>
+      <w:spacing w:val="-10"/>
+      <w:kern w:val="2"/>
+      <w:sz w:val="56"/>
+      <w:szCs w:val="56"/>
+    </w:rPr>
+  </w:style>
+  <w:style w:type="character" w:customStyle="1" w:styleId="SubtitleChar">
+    <w:name w:val="Subtitle Char"/>
+    <w:basedOn w:val="DefaultParagraphFont"/>
+    <w:link w:val="Subtitle"/>
+    <w:uiPriority w:val="11"/>
+    <w:qFormat/>
+    <w:rsid w:val="00837274"/>
+    <w:rPr>
+      <w:rFonts w:eastAsiaTheme="majorEastAsia" w:cstheme="majorBidi"/>
+      <w:color w:val="595959" w:themeColor="text1" w:themeTint="A6"/>
+      <w:spacing w:val="15"/>
+      <w:sz w:val="28"/>
+      <w:szCs w:val="28"/>
+    </w:rPr>
+  </w:style>
+  <w:style w:type="character" w:customStyle="1" w:styleId="QuoteChar">
+    <w:name w:val="Quote Char"/>
+    <w:basedOn w:val="DefaultParagraphFont"/>
+    <w:link w:val="Quote"/>
+    <w:uiPriority w:val="29"/>
+    <w:qFormat/>
+    <w:rsid w:val="00837274"/>
+    <w:rPr>
+      <w:i/>
+      <w:iCs/>
+      <w:color w:val="404040" w:themeColor="text1" w:themeTint="BF"/>
+    </w:rPr>
+  </w:style>
+  <w:style w:type="character" w:styleId="IntenseEmphasis">
+    <w:name w:val="Intense Emphasis"/>
+    <w:basedOn w:val="DefaultParagraphFont"/>
+    <w:uiPriority w:val="21"/>
+    <w:qFormat/>
+    <w:rsid w:val="00837274"/>
+    <w:rPr>
+      <w:i/>
+      <w:iCs/>
+      <w:color w:val="0F4761" w:themeColor="accent1" w:themeShade="BF"/>
+    </w:rPr>
+  </w:style>
+  <w:style w:type="character" w:customStyle="1" w:styleId="IntenseQuoteChar">
+    <w:name w:val="Intense Quote Char"/>
+    <w:basedOn w:val="DefaultParagraphFont"/>
+    <w:link w:val="IntenseQuote"/>
+    <w:uiPriority w:val="30"/>
+    <w:qFormat/>
+    <w:rsid w:val="00837274"/>
+    <w:rPr>
+      <w:i/>
+      <w:iCs/>
+      <w:color w:val="0F4761" w:themeColor="accent1" w:themeShade="BF"/>
+    </w:rPr>
+  </w:style>
+  <w:style w:type="character" w:styleId="IntenseReference">
+    <w:name w:val="Intense Reference"/>
+    <w:basedOn w:val="DefaultParagraphFont"/>
+    <w:uiPriority w:val="32"/>
+    <w:qFormat/>
+    <w:rsid w:val="00837274"/>
+    <w:rPr>
+      <w:b/>
+      <w:bCs/>
+      <w:smallCaps/>
+      <w:color w:val="0F4761" w:themeColor="accent1" w:themeShade="BF"/>
+      <w:spacing w:val="5"/>
+    </w:rPr>
+  </w:style>
+  <w:style w:type="paragraph" w:customStyle="1" w:styleId="Heading">
+    <w:name w:val="Heading"/>
+    <w:basedOn w:val="Normal"/>
+    <w:next w:val="BodyText"/>
+    <w:qFormat/>
+    <w:pPr>
+      <w:keepNext/>
+      <w:spacing w:before="240" w:after="120"/>
+    </w:pPr>
+    <w:rPr>
+      <w:rFonts w:ascii="Liberation Sans" w:eastAsia="Source Han Sans CN" w:hAnsi="Liberation Sans" w:cs="FreeSans"/>
+      <w:sz w:val="28"/>
+      <w:szCs w:val="28"/>
+    </w:rPr>
+  </w:style>
+  <w:style w:type="paragraph" w:styleId="BodyText">
+    <w:name w:val="Body Text"/>
+    <w:basedOn w:val="Normal"/>
+    <w:pPr>
+      <w:spacing w:after="140" w:line="276" w:lineRule="auto"/>
+    </w:pPr>
+  </w:style>
+  <w:style w:type="paragraph" w:styleId="List">
+    <w:name w:val="List"/>
+    <w:basedOn w:val="BodyText"/>
+    <w:rPr>
+      <w:rFonts w:cs="FreeSans"/>
+    </w:rPr>
+  </w:style>
+  <w:style w:type="paragraph" w:styleId="Caption">
+    <w:name w:val="caption"/>
+    <w:basedOn w:val="Normal"/>
+    <w:qFormat/>
+    <w:pPr>
+      <w:suppressLineNumbers/>
+      <w:spacing w:before="120" w:after="120"/>
+    </w:pPr>
+    <w:rPr>
+      <w:rFonts w:cs="FreeSans"/>
+      <w:i/>
+      <w:iCs/>
+      <w:sz w:val="24"/>
+      <w:szCs w:val="24"/>
+    </w:rPr>
+  </w:style>
+  <w:style w:type="paragraph" w:customStyle="1" w:styleId="Index">
+    <w:name w:val="Index"/>
+    <w:basedOn w:val="Normal"/>
+    <w:qFormat/>
+    <w:pPr>
+      <w:suppressLineNumbers/>
+    </w:pPr>
+    <w:rPr>
+      <w:rFonts w:cs="FreeSans"/>
+    </w:rPr>
+  </w:style>
+  <w:style w:type="paragraph" w:styleId="Title">
+    <w:name w:val="Title"/>
+    <w:basedOn w:val="Normal"/>
+    <w:next w:val="Normal"/>
+    <w:link w:val="TitleChar"/>
+    <w:uiPriority w:val="10"/>
+    <w:qFormat/>
+    <w:rsid w:val="00837274"/>
+    <w:pPr>
+      <w:spacing w:after="80" w:line="240" w:lineRule="auto"/>
+      <w:contextualSpacing/>
+    </w:pPr>
+    <w:rPr>
+      <w:rFonts w:asciiTheme="majorHAnsi" w:eastAsiaTheme="majorEastAsia" w:hAnsiTheme="majorHAnsi" w:cstheme="majorBidi"/>
+      <w:spacing w:val="-10"/>
+      <w:kern w:val="2"/>
+      <w:sz w:val="56"/>
+      <w:szCs w:val="56"/>
+    </w:rPr>
+  </w:style>
+  <w:style w:type="paragraph" w:styleId="Subtitle">
+    <w:name w:val="Subtitle"/>
+    <w:basedOn w:val="Normal"/>
+    <w:next w:val="Normal"/>
+    <w:link w:val="SubtitleChar"/>
+    <w:uiPriority w:val="11"/>
+    <w:qFormat/>
+    <w:rsid w:val="00837274"/>
+    <w:rPr>
+      <w:rFonts w:eastAsiaTheme="majorEastAsia" w:cstheme="majorBidi"/>
+      <w:color w:val="595959" w:themeColor="text1" w:themeTint="A6"/>
+      <w:spacing w:val="15"/>
+      <w:sz w:val="28"/>
+      <w:szCs w:val="28"/>
+    </w:rPr>
+  </w:style>
+  <w:style w:type="paragraph" w:styleId="Quote">
+    <w:name w:val="Quote"/>
+    <w:basedOn w:val="Normal"/>
+    <w:next w:val="Normal"/>
+    <w:link w:val="QuoteChar"/>
+    <w:uiPriority w:val="29"/>
+    <w:qFormat/>
+    <w:rsid w:val="00837274"/>
+    <w:pPr>
+      <w:spacing w:before="160"/>
+      <w:jc w:val="center"/>
+    </w:pPr>
+    <w:rPr>
+      <w:i/>
+      <w:iCs/>
+      <w:color w:val="404040" w:themeColor="text1" w:themeTint="BF"/>
+    </w:rPr>
+  </w:style>
+  <w:style w:type="paragraph" w:styleId="ListParagraph">
+    <w:name w:val="List Paragraph"/>
+    <w:basedOn w:val="Normal"/>
+    <w:uiPriority w:val="34"/>
+    <w:qFormat/>
+    <w:rsid w:val="00837274"/>
+    <w:pPr>
+      <w:ind w:left="720"/>
+      <w:contextualSpacing/>
+    </w:pPr>
+  </w:style>
+  <w:style w:type="paragraph" w:styleId="IntenseQuote">
+    <w:name w:val="Intense Quote"/>
+    <w:basedOn w:val="Normal"/>
+    <w:next w:val="Normal"/>
+    <w:link w:val="IntenseQuoteChar"/>
+    <w:uiPriority w:val="30"/>
+    <w:qFormat/>
+    <w:rsid w:val="00837274"/>
+    <w:pPr>
+      <w:pBdr>
+        <w:top w:val="single" w:sz="4" w:space="10" w:color="0F4761" w:themeColor="accent1" w:themeShade="BF"/>
+        <w:bottom w:val="single" w:sz="4" w:space="10" w:color="0F4761" w:themeColor="accent1" w:themeShade="BF"/>
+      </w:pBdr>
+      <w:spacing w:before="360" w:after="360"/>
+      <w:ind w:left="864" w:right="864"/>
+      <w:jc w:val="center"/>
+    </w:pPr>
+    <w:rPr>
+      <w:i/>
+      <w:iCs/>
+      <w:color w:val="0F4761" w:themeColor="accent1" w:themeShade="BF"/>
+    </w:rPr>
+  </w:style>
 </w:styles>
 </file>
 
 <file path=word/theme/theme1.xml><?xml version="1.0" encoding="utf-8"?>
-<a:theme xmlns:a="http://schemas.openxmlformats.org/drawingml/2006/main" xmlns:r="http://schemas.openxmlformats.org/officeDocument/2006/relationships" name="Office Theme">
+<a:theme xmlns:a="http://schemas.openxmlformats.org/drawingml/2006/main" name="Office Theme">
   <a:themeElements>
     <a:clrScheme name="Office">
       <a:dk1>
         <a:srgbClr val="000000"/>
       </a:dk1>
       <a:lt1>
-        <a:srgbClr val="ffffff"/>
+        <a:srgbClr val="FFFFFF"/>
       </a:lt1>
       <a:dk2>
-        <a:srgbClr val="0e2841"/>
+        <a:srgbClr val="0E2841"/>
       </a:dk2>
       <a:lt2>
-        <a:srgbClr val="e8e8e8"/>
+        <a:srgbClr val="E8E8E8"/>
       </a:lt2>
       <a:accent1>
         <a:srgbClr val="156082"/>
       </a:accent1>
       <a:accent2>
-        <a:srgbClr val="e97132"/>
+        <a:srgbClr val="E97132"/>
       </a:accent2>
       <a:accent3>
-        <a:srgbClr val="196b24"/>
+        <a:srgbClr val="196B24"/>
       </a:accent3>
       <a:accent4>
-        <a:srgbClr val="0f9ed5"/>
+        <a:srgbClr val="0F9ED5"/>
       </a:accent4>
       <a:accent5>
-        <a:srgbClr val="a02b93"/>
+        <a:srgbClr val="A02B93"/>
       </a:accent5>
       <a:accent6>
-        <a:srgbClr val="4ea72e"/>
+        <a:srgbClr val="4EA72E"/>
       </a:accent6>
       <a:hlink>
         <a:srgbClr val="467886"/>
       </a:hlink>
       <a:folHlink>
-        <a:srgbClr val="96607d"/>
+        <a:srgbClr val="96607D"/>
       </a:folHlink>
     </a:clrScheme>
     <a:fontScheme name="Office">
       <a:majorFont>
-        <a:latin typeface="Aptos Display" panose="02110004020202020204" pitchFamily="0" charset="1"/>
+        <a:latin typeface="Aptos Display" panose="02110004020202020204"/>
         <a:ea typeface=""/>
         <a:cs typeface=""/>
       </a:majorFont>
       <a:minorFont>
-        <a:latin typeface="Aptos" panose="02110004020202020204" pitchFamily="0" charset="1"/>
+        <a:latin typeface="Aptos" panose="02110004020202020204"/>
         <a:ea typeface=""/>
         <a:cs typeface=""/>
       </a:minorFont>
@@ -2715,7 +2678,7 @@
             </a:gs>
           </a:gsLst>
           <a:lin ang="5400000" scaled="0"/>
-          <a:tileRect l="0" t="0" r="0" b="0"/>
+          <a:tileRect/>
         </a:gradFill>
         <a:gradFill>
           <a:gsLst>
@@ -2739,7 +2702,7 @@
             </a:gs>
           </a:gsLst>
           <a:lin ang="5400000" scaled="0"/>
-          <a:tileRect l="0" t="0" r="0" b="0"/>
+          <a:tileRect/>
         </a:gradFill>
       </a:fillStyleLst>
       <a:lnStyleLst>
@@ -2799,10 +2762,12 @@
             </a:gs>
           </a:gsLst>
           <a:lin ang="5400000" scaled="0"/>
-          <a:tileRect l="0" t="0" r="0" b="0"/>
+          <a:tileRect/>
         </a:gradFill>
       </a:bgFillStyleLst>
     </a:fmtScheme>
   </a:themeElements>
+  <a:objectDefaults/>
+  <a:extraClrSchemeLst/>
 </a:theme>
 </file>
</xml_diff>